<commit_message>
figure and lab doc update
</commit_message>
<xml_diff>
--- a/RVfpga/RVfpgaEL2/RVfpga_NexysVideo-NoDDR/Labs/Lab05/RVfpga_Lab05_VeeR-EL2_NexysVideo-NoDDR.docx
+++ b/RVfpga/RVfpgaEL2/RVfpga_NexysVideo-NoDDR/Labs/Lab05/RVfpga_Lab05_VeeR-EL2_NexysVideo-NoDDR.docx
@@ -290,6 +290,7 @@
         </w:rPr>
         <w:t xml:space="preserve">Creating a </w:t>
       </w:r>
+      <w:proofErr w:type="spellStart"/>
       <w:r>
         <w:rPr>
           <w:rFonts w:cs="Arial"/>
@@ -300,7 +301,20 @@
           <w:szCs w:val="56"/>
           <w:lang w:val="en-US" w:eastAsia="en-GB"/>
         </w:rPr>
-        <w:t>Vivado Project</w:t>
+        <w:t>Vivado</w:t>
+      </w:r>
+      <w:proofErr w:type="spellEnd"/>
+      <w:r>
+        <w:rPr>
+          <w:rFonts w:cs="Arial"/>
+          <w:b/>
+          <w:bCs/>
+          <w:color w:val="00000A"/>
+          <w:sz w:val="56"/>
+          <w:szCs w:val="56"/>
+          <w:lang w:val="en-US" w:eastAsia="en-GB"/>
+        </w:rPr>
+        <w:t xml:space="preserve"> Project</w:t>
       </w:r>
     </w:p>
     <w:p>
@@ -401,8 +415,13 @@
       <w:bookmarkStart w:id="4" w:name="_Toc39259539"/>
     </w:p>
     <w:p>
-      <w:r>
-        <w:t xml:space="preserve">In order to work with and modify </w:t>
+      <w:proofErr w:type="gramStart"/>
+      <w:r>
+        <w:t>In order to</w:t>
+      </w:r>
+      <w:proofErr w:type="gramEnd"/>
+      <w:r>
+        <w:t xml:space="preserve"> work with and modify </w:t>
       </w:r>
       <w:r>
         <w:t xml:space="preserve">the </w:t>
@@ -423,10 +442,34 @@
         <w:t>ystem</w:t>
       </w:r>
       <w:r>
-        <w:t xml:space="preserve">, you will need to build a project that includes all of the Verilog, SystemVerilog, header, configuration, and text files that define the system. </w:t>
-      </w:r>
-      <w:r>
-        <w:t>In this lab, we show how to create a Vivado pr</w:t>
+        <w:t xml:space="preserve">, you will need to build a project that includes </w:t>
+      </w:r>
+      <w:proofErr w:type="gramStart"/>
+      <w:r>
+        <w:t>all of</w:t>
+      </w:r>
+      <w:proofErr w:type="gramEnd"/>
+      <w:r>
+        <w:t xml:space="preserve"> the Verilog, </w:t>
+      </w:r>
+      <w:proofErr w:type="spellStart"/>
+      <w:r>
+        <w:t>SystemVerilog</w:t>
+      </w:r>
+      <w:proofErr w:type="spellEnd"/>
+      <w:r>
+        <w:t xml:space="preserve">, header, configuration, and text files that define the system. </w:t>
+      </w:r>
+      <w:r>
+        <w:t xml:space="preserve">In this lab, we show how to create a </w:t>
+      </w:r>
+      <w:proofErr w:type="spellStart"/>
+      <w:r>
+        <w:t>Vivado</w:t>
+      </w:r>
+      <w:proofErr w:type="spellEnd"/>
+      <w:r>
+        <w:t xml:space="preserve"> pr</w:t>
       </w:r>
       <w:r>
         <w:t xml:space="preserve">oject that targets </w:t>
@@ -437,18 +480,30 @@
       <w:r>
         <w:t xml:space="preserve">to </w:t>
       </w:r>
+      <w:proofErr w:type="spellStart"/>
       <w:r>
         <w:t>Digilent</w:t>
       </w:r>
       <w:r>
         <w:t>’s</w:t>
       </w:r>
+      <w:proofErr w:type="spellEnd"/>
       <w:r>
         <w:t xml:space="preserve"> </w:t>
       </w:r>
-      <w:r>
-        <w:t>Nexys Video Video</w:t>
-      </w:r>
+      <w:proofErr w:type="spellStart"/>
+      <w:r>
+        <w:t>Nexys</w:t>
+      </w:r>
+      <w:proofErr w:type="spellEnd"/>
+      <w:r>
+        <w:t xml:space="preserve"> Video </w:t>
+      </w:r>
+      <w:proofErr w:type="spellStart"/>
+      <w:r>
+        <w:t>Video</w:t>
+      </w:r>
+      <w:proofErr w:type="spellEnd"/>
       <w:r>
         <w:t xml:space="preserve"> FPGA</w:t>
       </w:r>
@@ -540,7 +595,21 @@
         <w:rPr>
           <w:rFonts w:cs="Arial"/>
         </w:rPr>
-        <w:t>If you haven’t already done so, install Xilinx’s Vivado 20</w:t>
+        <w:t xml:space="preserve">If you haven’t already done so, install Xilinx’s </w:t>
+      </w:r>
+      <w:proofErr w:type="spellStart"/>
+      <w:r>
+        <w:rPr>
+          <w:rFonts w:cs="Arial"/>
+        </w:rPr>
+        <w:t>Vivado</w:t>
+      </w:r>
+      <w:proofErr w:type="spellEnd"/>
+      <w:r>
+        <w:rPr>
+          <w:rFonts w:cs="Arial"/>
+        </w:rPr>
+        <w:t xml:space="preserve"> 20</w:t>
       </w:r>
       <w:r>
         <w:rPr>
@@ -594,17 +663,47 @@
         </w:rPr>
         <w:t xml:space="preserve">The core frequency of the default RVfpgaEL2 System for a </w:t>
       </w:r>
-      <w:r>
-        <w:rPr>
-          <w:rFonts w:cs="Arial"/>
-        </w:rPr>
-        <w:t>Nexys Video Video</w:t>
-      </w:r>
-      <w:r>
-        <w:rPr>
-          <w:rFonts w:cs="Arial"/>
-        </w:rPr>
-        <w:t xml:space="preserve"> board is 12.5 Mhz (bitstream provided at </w:t>
+      <w:proofErr w:type="spellStart"/>
+      <w:r>
+        <w:rPr>
+          <w:rFonts w:cs="Arial"/>
+        </w:rPr>
+        <w:t>Nexys</w:t>
+      </w:r>
+      <w:proofErr w:type="spellEnd"/>
+      <w:r>
+        <w:rPr>
+          <w:rFonts w:cs="Arial"/>
+        </w:rPr>
+        <w:t xml:space="preserve"> Video </w:t>
+      </w:r>
+      <w:proofErr w:type="spellStart"/>
+      <w:r>
+        <w:rPr>
+          <w:rFonts w:cs="Arial"/>
+        </w:rPr>
+        <w:t>Video</w:t>
+      </w:r>
+      <w:proofErr w:type="spellEnd"/>
+      <w:r>
+        <w:rPr>
+          <w:rFonts w:cs="Arial"/>
+        </w:rPr>
+        <w:t xml:space="preserve"> board is 12.5 </w:t>
+      </w:r>
+      <w:proofErr w:type="spellStart"/>
+      <w:r>
+        <w:rPr>
+          <w:rFonts w:cs="Arial"/>
+        </w:rPr>
+        <w:t>Mhz</w:t>
+      </w:r>
+      <w:proofErr w:type="spellEnd"/>
+      <w:r>
+        <w:rPr>
+          <w:rFonts w:cs="Arial"/>
+        </w:rPr>
+        <w:t xml:space="preserve"> (bitstream provided at </w:t>
       </w:r>
       <w:r>
         <w:rPr>
@@ -626,8 +725,9 @@
           <w:iCs/>
           <w:color w:val="000000" w:themeColor="text1"/>
         </w:rPr>
-        <w:t>Nexys Video</w:t>
-      </w:r>
+        <w:t xml:space="preserve">Nexys </w:t>
+      </w:r>
+      <w:proofErr w:type="spellStart"/>
       <w:r>
         <w:rPr>
           <w:rFonts w:eastAsia="Arial" w:cs="Arial"/>
@@ -637,7 +737,7 @@
           <w:iCs/>
           <w:color w:val="000000" w:themeColor="text1"/>
         </w:rPr>
-        <w:t>VideoNoDDRPath]</w:t>
+        <w:t>Video</w:t>
       </w:r>
       <w:r>
         <w:rPr>
@@ -648,8 +748,9 @@
           <w:iCs/>
           <w:color w:val="000000" w:themeColor="text1"/>
         </w:rPr>
-        <w:t>/src/rvfpga</w:t>
-      </w:r>
+        <w:t>VideoNoDDRPath</w:t>
+      </w:r>
+      <w:proofErr w:type="spellEnd"/>
       <w:r>
         <w:rPr>
           <w:rFonts w:eastAsia="Arial" w:cs="Arial"/>
@@ -659,7 +760,7 @@
           <w:iCs/>
           <w:color w:val="000000" w:themeColor="text1"/>
         </w:rPr>
-        <w:t>Nexys Video</w:t>
+        <w:t>]</w:t>
       </w:r>
       <w:r>
         <w:rPr>
@@ -670,8 +771,91 @@
           <w:iCs/>
           <w:color w:val="000000" w:themeColor="text1"/>
         </w:rPr>
+        <w:t>/</w:t>
+      </w:r>
+      <w:proofErr w:type="spellStart"/>
+      <w:r>
+        <w:rPr>
+          <w:rFonts w:eastAsia="Arial" w:cs="Arial"/>
+          <w:b/>
+          <w:bCs/>
+          <w:i/>
+          <w:iCs/>
+          <w:color w:val="000000" w:themeColor="text1"/>
+        </w:rPr>
+        <w:t>src</w:t>
+      </w:r>
+      <w:proofErr w:type="spellEnd"/>
+      <w:r>
+        <w:rPr>
+          <w:rFonts w:eastAsia="Arial" w:cs="Arial"/>
+          <w:b/>
+          <w:bCs/>
+          <w:i/>
+          <w:iCs/>
+          <w:color w:val="000000" w:themeColor="text1"/>
+        </w:rPr>
+        <w:t>/</w:t>
+      </w:r>
+      <w:proofErr w:type="spellStart"/>
+      <w:r>
+        <w:rPr>
+          <w:rFonts w:eastAsia="Arial" w:cs="Arial"/>
+          <w:b/>
+          <w:bCs/>
+          <w:i/>
+          <w:iCs/>
+          <w:color w:val="000000" w:themeColor="text1"/>
+        </w:rPr>
+        <w:t>rvfpga</w:t>
+      </w:r>
+      <w:r>
+        <w:rPr>
+          <w:rFonts w:eastAsia="Arial" w:cs="Arial"/>
+          <w:b/>
+          <w:bCs/>
+          <w:i/>
+          <w:iCs/>
+          <w:color w:val="000000" w:themeColor="text1"/>
+        </w:rPr>
+        <w:t>Nexys</w:t>
+      </w:r>
+      <w:proofErr w:type="spellEnd"/>
+      <w:r>
+        <w:rPr>
+          <w:rFonts w:eastAsia="Arial" w:cs="Arial"/>
+          <w:b/>
+          <w:bCs/>
+          <w:i/>
+          <w:iCs/>
+          <w:color w:val="000000" w:themeColor="text1"/>
+        </w:rPr>
+        <w:t xml:space="preserve"> </w:t>
+      </w:r>
+      <w:proofErr w:type="spellStart"/>
+      <w:r>
+        <w:rPr>
+          <w:rFonts w:eastAsia="Arial" w:cs="Arial"/>
+          <w:b/>
+          <w:bCs/>
+          <w:i/>
+          <w:iCs/>
+          <w:color w:val="000000" w:themeColor="text1"/>
+        </w:rPr>
+        <w:t>Video</w:t>
+      </w:r>
+      <w:r>
+        <w:rPr>
+          <w:rFonts w:eastAsia="Arial" w:cs="Arial"/>
+          <w:b/>
+          <w:bCs/>
+          <w:i/>
+          <w:iCs/>
+          <w:color w:val="000000" w:themeColor="text1"/>
+        </w:rPr>
         <w:t>.bit</w:t>
       </w:r>
+      <w:proofErr w:type="spellEnd"/>
       <w:r>
         <w:rPr>
           <w:rFonts w:cs="Arial"/>
@@ -706,8 +890,16 @@
         <w:rPr>
           <w:rFonts w:cs="Arial"/>
         </w:rPr>
-        <w:t>it provides some timing violations when the bitstream is created in Vivado</w:t>
-      </w:r>
+        <w:t xml:space="preserve">it provides some timing violations when the bitstream is created in </w:t>
+      </w:r>
+      <w:proofErr w:type="spellStart"/>
+      <w:r>
+        <w:rPr>
+          <w:rFonts w:cs="Arial"/>
+        </w:rPr>
+        <w:t>Vivado</w:t>
+      </w:r>
+      <w:proofErr w:type="spellEnd"/>
       <w:r>
         <w:rPr>
           <w:rFonts w:cs="Arial"/>
@@ -745,12 +937,26 @@
         <w:rPr>
           <w:color w:val="FFFFFF" w:themeColor="background1"/>
         </w:rPr>
-        <w:t xml:space="preserve">Creating a Vivado Project for </w:t>
-      </w:r>
+        <w:t xml:space="preserve">Creating a </w:t>
+      </w:r>
+      <w:proofErr w:type="spellStart"/>
       <w:r>
         <w:rPr>
           <w:color w:val="FFFFFF" w:themeColor="background1"/>
         </w:rPr>
+        <w:t>Vivado</w:t>
+      </w:r>
+      <w:proofErr w:type="spellEnd"/>
+      <w:r>
+        <w:rPr>
+          <w:color w:val="FFFFFF" w:themeColor="background1"/>
+        </w:rPr>
+        <w:t xml:space="preserve"> Project for </w:t>
+      </w:r>
+      <w:r>
+        <w:rPr>
+          <w:color w:val="FFFFFF" w:themeColor="background1"/>
+        </w:rPr>
         <w:t>RVfpgaEL2-</w:t>
       </w:r>
       <w:r>
@@ -783,7 +989,21 @@
         <w:rPr>
           <w:rFonts w:cs="Arial"/>
         </w:rPr>
-        <w:t xml:space="preserve">You will use Xilinx’s Vivado Design Suite to build the </w:t>
+        <w:t xml:space="preserve">You will use Xilinx’s </w:t>
+      </w:r>
+      <w:proofErr w:type="spellStart"/>
+      <w:r>
+        <w:rPr>
+          <w:rFonts w:cs="Arial"/>
+        </w:rPr>
+        <w:t>Vivado</w:t>
+      </w:r>
+      <w:proofErr w:type="spellEnd"/>
+      <w:r>
+        <w:rPr>
+          <w:rFonts w:cs="Arial"/>
+        </w:rPr>
+        <w:t xml:space="preserve"> Design Suite to build the </w:t>
       </w:r>
       <w:r>
         <w:rPr>
@@ -875,12 +1095,28 @@
         </w:rPr>
         <w:t xml:space="preserve">system and target it to a </w:t>
       </w:r>
-      <w:r>
-        <w:rPr>
-          <w:rFonts w:cs="Arial"/>
-        </w:rPr>
-        <w:t>Nexys Video Video</w:t>
-      </w:r>
+      <w:proofErr w:type="spellStart"/>
+      <w:r>
+        <w:rPr>
+          <w:rFonts w:cs="Arial"/>
+        </w:rPr>
+        <w:t>Nexys</w:t>
+      </w:r>
+      <w:proofErr w:type="spellEnd"/>
+      <w:r>
+        <w:rPr>
+          <w:rFonts w:cs="Arial"/>
+        </w:rPr>
+        <w:t xml:space="preserve"> Video </w:t>
+      </w:r>
+      <w:proofErr w:type="spellStart"/>
+      <w:r>
+        <w:rPr>
+          <w:rFonts w:cs="Arial"/>
+        </w:rPr>
+        <w:t>Video</w:t>
+      </w:r>
+      <w:proofErr w:type="spellEnd"/>
       <w:r>
         <w:rPr>
           <w:rFonts w:cs="Arial"/>
@@ -928,8 +1164,17 @@
           <w:rFonts w:cs="Arial"/>
           <w:b/>
         </w:rPr>
-        <w:t xml:space="preserve"> Vivado</w:t>
-      </w:r>
+        <w:t xml:space="preserve"> </w:t>
+      </w:r>
+      <w:proofErr w:type="spellStart"/>
+      <w:r>
+        <w:rPr>
+          <w:rFonts w:cs="Arial"/>
+          <w:b/>
+        </w:rPr>
+        <w:t>Vivado</w:t>
+      </w:r>
+      <w:proofErr w:type="spellEnd"/>
     </w:p>
     <w:p>
       <w:pPr>
@@ -1000,6 +1245,7 @@
         </w:rPr>
         <w:t xml:space="preserve">Step 4. Select </w:t>
       </w:r>
+      <w:proofErr w:type="spellStart"/>
       <w:r>
         <w:rPr>
           <w:rFonts w:eastAsia="Times New Roman" w:cs="Arial"/>
@@ -1007,8 +1253,29 @@
           <w:bCs/>
           <w:color w:val="000000" w:themeColor="text1"/>
         </w:rPr>
-        <w:t>Nexys Video Video</w:t>
-      </w:r>
+        <w:t>Nexys</w:t>
+      </w:r>
+      <w:proofErr w:type="spellEnd"/>
+      <w:r>
+        <w:rPr>
+          <w:rFonts w:eastAsia="Times New Roman" w:cs="Arial"/>
+          <w:b/>
+          <w:bCs/>
+          <w:color w:val="000000" w:themeColor="text1"/>
+        </w:rPr>
+        <w:t xml:space="preserve"> Video </w:t>
+      </w:r>
+      <w:proofErr w:type="spellStart"/>
+      <w:r>
+        <w:rPr>
+          <w:rFonts w:eastAsia="Times New Roman" w:cs="Arial"/>
+          <w:b/>
+          <w:bCs/>
+          <w:color w:val="000000" w:themeColor="text1"/>
+        </w:rPr>
+        <w:t>Video</w:t>
+      </w:r>
+      <w:proofErr w:type="spellEnd"/>
       <w:r>
         <w:rPr>
           <w:rFonts w:eastAsia="Times New Roman" w:cs="Arial"/>
@@ -1072,8 +1339,9 @@
           <w:bCs/>
           <w:color w:val="000000" w:themeColor="text1"/>
         </w:rPr>
-        <w:t>Step 5. Set rvfpga</w:t>
-      </w:r>
+        <w:t xml:space="preserve">Step 5. Set </w:t>
+      </w:r>
+      <w:proofErr w:type="spellStart"/>
       <w:r>
         <w:rPr>
           <w:rFonts w:eastAsia="Times New Roman" w:cs="Arial"/>
@@ -1081,7 +1349,7 @@
           <w:bCs/>
           <w:color w:val="000000" w:themeColor="text1"/>
         </w:rPr>
-        <w:t>Nexys Video</w:t>
+        <w:t>rvfpga</w:t>
       </w:r>
       <w:r>
         <w:rPr>
@@ -1090,6 +1358,25 @@
           <w:bCs/>
           <w:color w:val="000000" w:themeColor="text1"/>
         </w:rPr>
+        <w:t>Nexys</w:t>
+      </w:r>
+      <w:proofErr w:type="spellEnd"/>
+      <w:r>
+        <w:rPr>
+          <w:rFonts w:eastAsia="Times New Roman" w:cs="Arial"/>
+          <w:b/>
+          <w:bCs/>
+          <w:color w:val="000000" w:themeColor="text1"/>
+        </w:rPr>
+        <w:t xml:space="preserve"> Video</w:t>
+      </w:r>
+      <w:r>
+        <w:rPr>
+          <w:rFonts w:eastAsia="Times New Roman" w:cs="Arial"/>
+          <w:b/>
+          <w:bCs/>
+          <w:color w:val="000000" w:themeColor="text1"/>
+        </w:rPr>
         <w:t xml:space="preserve"> as</w:t>
       </w:r>
       <w:r>
@@ -1110,6 +1397,7 @@
         </w:rPr>
         <w:t xml:space="preserve"> Top Module, set </w:t>
       </w:r>
+      <w:proofErr w:type="spellStart"/>
       <w:r>
         <w:rPr>
           <w:rFonts w:eastAsia="Times New Roman" w:cs="Arial"/>
@@ -1119,17 +1407,9 @@
           <w:iCs/>
           <w:color w:val="000000" w:themeColor="text1"/>
         </w:rPr>
-        <w:t>common_defines.vh</w:t>
-      </w:r>
-      <w:r>
-        <w:rPr>
-          <w:rFonts w:eastAsia="Times New Roman" w:cs="Arial"/>
-          <w:b/>
-          <w:bCs/>
-          <w:color w:val="000000" w:themeColor="text1"/>
-        </w:rPr>
-        <w:t xml:space="preserve"> as global, set </w:t>
-      </w:r>
+        <w:t>common_</w:t>
+      </w:r>
+      <w:proofErr w:type="gramStart"/>
       <w:r>
         <w:rPr>
           <w:rFonts w:eastAsia="Times New Roman" w:cs="Arial"/>
@@ -1139,8 +1419,10 @@
           <w:iCs/>
           <w:color w:val="000000" w:themeColor="text1"/>
         </w:rPr>
-        <w:t>el2_pdef</w:t>
-      </w:r>
+        <w:t>defines.vh</w:t>
+      </w:r>
+      <w:proofErr w:type="spellEnd"/>
+      <w:proofErr w:type="gramEnd"/>
       <w:r>
         <w:rPr>
           <w:rFonts w:eastAsia="Times New Roman" w:cs="Arial"/>
@@ -1148,7 +1430,7 @@
           <w:bCs/>
           <w:color w:val="000000" w:themeColor="text1"/>
         </w:rPr>
-        <w:t xml:space="preserve"> both as global and as a System Verilog file, add </w:t>
+        <w:t xml:space="preserve"> as global, set </w:t>
       </w:r>
       <w:r>
         <w:rPr>
@@ -1159,7 +1441,7 @@
           <w:iCs/>
           <w:color w:val="000000" w:themeColor="text1"/>
         </w:rPr>
-        <w:t>boot_main.mem</w:t>
+        <w:t>el2_pdef</w:t>
       </w:r>
       <w:r>
         <w:rPr>
@@ -1168,26 +1450,9 @@
           <w:bCs/>
           <w:color w:val="000000" w:themeColor="text1"/>
         </w:rPr>
-        <w:t xml:space="preserve"> to the project, include folders</w:t>
-      </w:r>
-      <w:r>
-        <w:rPr>
-          <w:rFonts w:eastAsia="Times New Roman" w:cs="Arial"/>
-          <w:b/>
-          <w:bCs/>
-          <w:color w:val="000000" w:themeColor="text1"/>
-        </w:rPr>
-        <w:t>,</w:t>
-      </w:r>
-      <w:r>
-        <w:rPr>
-          <w:rFonts w:eastAsia="Times New Roman" w:cs="Arial"/>
-          <w:b/>
-          <w:bCs/>
-          <w:color w:val="000000" w:themeColor="text1"/>
-        </w:rPr>
-        <w:t xml:space="preserve"> and add </w:t>
-      </w:r>
+        <w:t xml:space="preserve"> both as global and as a System Verilog file, add </w:t>
+      </w:r>
+      <w:proofErr w:type="spellStart"/>
       <w:r>
         <w:rPr>
           <w:rFonts w:eastAsia="Times New Roman" w:cs="Arial"/>
@@ -1197,6 +1462,45 @@
           <w:iCs/>
           <w:color w:val="000000" w:themeColor="text1"/>
         </w:rPr>
+        <w:t>boot_main.mem</w:t>
+      </w:r>
+      <w:proofErr w:type="spellEnd"/>
+      <w:r>
+        <w:rPr>
+          <w:rFonts w:eastAsia="Times New Roman" w:cs="Arial"/>
+          <w:b/>
+          <w:bCs/>
+          <w:color w:val="000000" w:themeColor="text1"/>
+        </w:rPr>
+        <w:t xml:space="preserve"> to the project, include folders</w:t>
+      </w:r>
+      <w:r>
+        <w:rPr>
+          <w:rFonts w:eastAsia="Times New Roman" w:cs="Arial"/>
+          <w:b/>
+          <w:bCs/>
+          <w:color w:val="000000" w:themeColor="text1"/>
+        </w:rPr>
+        <w:t>,</w:t>
+      </w:r>
+      <w:r>
+        <w:rPr>
+          <w:rFonts w:eastAsia="Times New Roman" w:cs="Arial"/>
+          <w:b/>
+          <w:bCs/>
+          <w:color w:val="000000" w:themeColor="text1"/>
+        </w:rPr>
+        <w:t xml:space="preserve"> and add </w:t>
+      </w:r>
+      <w:r>
+        <w:rPr>
+          <w:rFonts w:eastAsia="Times New Roman" w:cs="Arial"/>
+          <w:b/>
+          <w:bCs/>
+          <w:i/>
+          <w:iCs/>
+          <w:color w:val="000000" w:themeColor="text1"/>
+        </w:rPr>
         <w:t>–sweep</w:t>
       </w:r>
       <w:r>
@@ -1293,20 +1597,57 @@
           <w:rFonts w:cs="Arial"/>
           <w:b/>
         </w:rPr>
-        <w:t xml:space="preserve"> Vivado</w:t>
-      </w:r>
-    </w:p>
-    <w:p>
-      <w:pPr>
-        <w:rPr>
-          <w:rFonts w:cs="Arial"/>
-        </w:rPr>
-      </w:pPr>
-      <w:r>
-        <w:rPr>
-          <w:rFonts w:cs="Arial"/>
-        </w:rPr>
-        <w:t xml:space="preserve">If you did not install Vivado on your machine as described in the RVfpga Getting Started Guide, do so now. Be sure to install the board files as well. </w:t>
+        <w:t xml:space="preserve"> </w:t>
+      </w:r>
+      <w:proofErr w:type="spellStart"/>
+      <w:r>
+        <w:rPr>
+          <w:rFonts w:cs="Arial"/>
+          <w:b/>
+        </w:rPr>
+        <w:t>Vivado</w:t>
+      </w:r>
+      <w:proofErr w:type="spellEnd"/>
+    </w:p>
+    <w:p>
+      <w:pPr>
+        <w:rPr>
+          <w:rFonts w:cs="Arial"/>
+        </w:rPr>
+      </w:pPr>
+      <w:r>
+        <w:rPr>
+          <w:rFonts w:cs="Arial"/>
+        </w:rPr>
+        <w:t xml:space="preserve">If you did not install </w:t>
+      </w:r>
+      <w:proofErr w:type="spellStart"/>
+      <w:r>
+        <w:rPr>
+          <w:rFonts w:cs="Arial"/>
+        </w:rPr>
+        <w:t>Vivado</w:t>
+      </w:r>
+      <w:proofErr w:type="spellEnd"/>
+      <w:r>
+        <w:rPr>
+          <w:rFonts w:cs="Arial"/>
+        </w:rPr>
+        <w:t xml:space="preserve"> on your machine as described in the </w:t>
+      </w:r>
+      <w:proofErr w:type="spellStart"/>
+      <w:r>
+        <w:rPr>
+          <w:rFonts w:cs="Arial"/>
+        </w:rPr>
+        <w:t>RVfpga</w:t>
+      </w:r>
+      <w:proofErr w:type="spellEnd"/>
+      <w:r>
+        <w:rPr>
+          <w:rFonts w:cs="Arial"/>
+        </w:rPr>
+        <w:t xml:space="preserve"> Getting Started Guide, do so now. Be sure to install the board files as well. </w:t>
       </w:r>
     </w:p>
     <w:p>
@@ -1332,7 +1673,21 @@
         <w:rPr>
           <w:rFonts w:cs="Arial"/>
         </w:rPr>
-        <w:t>, run Vivado (</w:t>
+        <w:t xml:space="preserve">, run </w:t>
+      </w:r>
+      <w:proofErr w:type="spellStart"/>
+      <w:r>
+        <w:rPr>
+          <w:rFonts w:cs="Arial"/>
+        </w:rPr>
+        <w:t>Vivado</w:t>
+      </w:r>
+      <w:proofErr w:type="spellEnd"/>
+      <w:r>
+        <w:rPr>
+          <w:rFonts w:cs="Arial"/>
+        </w:rPr>
+        <w:t xml:space="preserve"> (</w:t>
       </w:r>
       <w:r>
         <w:rPr>
@@ -1359,8 +1714,16 @@
         <w:rPr>
           <w:rFonts w:cs="Arial"/>
         </w:rPr>
-        <w:t>open a terminal and type: vivado</w:t>
-      </w:r>
+        <w:t xml:space="preserve">open a terminal and type: </w:t>
+      </w:r>
+      <w:proofErr w:type="spellStart"/>
+      <w:r>
+        <w:rPr>
+          <w:rFonts w:cs="Arial"/>
+        </w:rPr>
+        <w:t>vivado</w:t>
+      </w:r>
+      <w:proofErr w:type="spellEnd"/>
       <w:r>
         <w:rPr>
           <w:rFonts w:cs="Arial"/>
@@ -1380,13 +1743,41 @@
         <w:rPr>
           <w:rFonts w:cs="Arial"/>
         </w:rPr>
-        <w:t>, open Vivado from the Start menu</w:t>
-      </w:r>
-      <w:r>
-        <w:rPr>
-          <w:rFonts w:cs="Arial"/>
-        </w:rPr>
-        <w:t>). The Vivado welcome screen will open</w:t>
+        <w:t xml:space="preserve">, open </w:t>
+      </w:r>
+      <w:proofErr w:type="spellStart"/>
+      <w:r>
+        <w:rPr>
+          <w:rFonts w:cs="Arial"/>
+        </w:rPr>
+        <w:t>Vivado</w:t>
+      </w:r>
+      <w:proofErr w:type="spellEnd"/>
+      <w:r>
+        <w:rPr>
+          <w:rFonts w:cs="Arial"/>
+        </w:rPr>
+        <w:t xml:space="preserve"> from the Start menu</w:t>
+      </w:r>
+      <w:r>
+        <w:rPr>
+          <w:rFonts w:cs="Arial"/>
+        </w:rPr>
+        <w:t xml:space="preserve">). The </w:t>
+      </w:r>
+      <w:proofErr w:type="spellStart"/>
+      <w:r>
+        <w:rPr>
+          <w:rFonts w:cs="Arial"/>
+        </w:rPr>
+        <w:t>Vivado</w:t>
+      </w:r>
+      <w:proofErr w:type="spellEnd"/>
+      <w:r>
+        <w:rPr>
+          <w:rFonts w:cs="Arial"/>
+        </w:rPr>
+        <w:t xml:space="preserve"> welcome screen will open</w:t>
       </w:r>
       <w:r>
         <w:rPr>
@@ -1533,7 +1924,15 @@
       </w:r>
       <w:bookmarkEnd w:id="5"/>
       <w:r>
-        <w:t>. Vivado welcome screen</w:t>
+        <w:t xml:space="preserve">. </w:t>
+      </w:r>
+      <w:proofErr w:type="spellStart"/>
+      <w:r>
+        <w:t>Vivado</w:t>
+      </w:r>
+      <w:proofErr w:type="spellEnd"/>
+      <w:r>
+        <w:t xml:space="preserve"> welcome screen</w:t>
       </w:r>
       <w:r>
         <w:t>:</w:t>
@@ -1594,7 +1993,21 @@
         <w:rPr>
           <w:b w:val="0"/>
         </w:rPr>
-        <w:t xml:space="preserve">The Create a New Vivado Project Wizard will </w:t>
+        <w:t xml:space="preserve">The Create a New </w:t>
+      </w:r>
+      <w:proofErr w:type="spellStart"/>
+      <w:r>
+        <w:rPr>
+          <w:b w:val="0"/>
+        </w:rPr>
+        <w:t>Vivado</w:t>
+      </w:r>
+      <w:proofErr w:type="spellEnd"/>
+      <w:r>
+        <w:rPr>
+          <w:b w:val="0"/>
+        </w:rPr>
+        <w:t xml:space="preserve"> Project Wizard will </w:t>
       </w:r>
       <w:r>
         <w:rPr>
@@ -1759,8 +2172,13 @@
       <w:r>
         <w:t xml:space="preserve">Create a New </w:t>
       </w:r>
-      <w:r>
-        <w:t xml:space="preserve">Vivado </w:t>
+      <w:proofErr w:type="spellStart"/>
+      <w:r>
+        <w:t>Vivado</w:t>
+      </w:r>
+      <w:proofErr w:type="spellEnd"/>
+      <w:r>
+        <w:t xml:space="preserve"> </w:t>
       </w:r>
       <w:r>
         <w:t>Project Wizard</w:t>
@@ -1809,14 +2227,30 @@
           <w:b w:val="0"/>
           <w:i/>
         </w:rPr>
-        <w:t>Nexys Video</w:t>
-      </w:r>
+        <w:t xml:space="preserve">Nexys </w:t>
+      </w:r>
+      <w:proofErr w:type="spellStart"/>
       <w:r>
         <w:rPr>
           <w:b w:val="0"/>
           <w:i/>
         </w:rPr>
-        <w:t>VideoNoDDRPath]</w:t>
+        <w:t>Video</w:t>
+      </w:r>
+      <w:r>
+        <w:rPr>
+          <w:b w:val="0"/>
+          <w:i/>
+        </w:rPr>
+        <w:t>VideoNoDDRPath</w:t>
+      </w:r>
+      <w:proofErr w:type="spellEnd"/>
+      <w:r>
+        <w:rPr>
+          <w:b w:val="0"/>
+          <w:i/>
+        </w:rPr>
+        <w:t>]</w:t>
       </w:r>
       <w:r>
         <w:rPr>
@@ -2065,7 +2499,21 @@
         <w:rPr>
           <w:b w:val="0"/>
         </w:rPr>
-        <w:t>Select the project type as RTL Project, and click Next</w:t>
+        <w:t xml:space="preserve">Select the project type as </w:t>
+      </w:r>
+      <w:proofErr w:type="gramStart"/>
+      <w:r>
+        <w:rPr>
+          <w:b w:val="0"/>
+        </w:rPr>
+        <w:t>RTL Project, and</w:t>
+      </w:r>
+      <w:proofErr w:type="gramEnd"/>
+      <w:r>
+        <w:rPr>
+          <w:b w:val="0"/>
+        </w:rPr>
+        <w:t xml:space="preserve"> click Next</w:t>
       </w:r>
       <w:r>
         <w:rPr>
@@ -2276,22 +2724,47 @@
           <w:b w:val="0"/>
           <w:i/>
         </w:rPr>
-        <w:t>Nexys Video</w:t>
-      </w:r>
+        <w:t xml:space="preserve">Nexys </w:t>
+      </w:r>
+      <w:proofErr w:type="spellStart"/>
       <w:r>
         <w:rPr>
           <w:b w:val="0"/>
           <w:i/>
         </w:rPr>
-        <w:t>VideoNoDDRPath]</w:t>
+        <w:t>Video</w:t>
       </w:r>
       <w:r>
         <w:rPr>
           <w:b w:val="0"/>
           <w:i/>
         </w:rPr>
-        <w:t>/src</w:t>
-      </w:r>
+        <w:t>VideoNoDDRPath</w:t>
+      </w:r>
+      <w:proofErr w:type="spellEnd"/>
+      <w:r>
+        <w:rPr>
+          <w:b w:val="0"/>
+          <w:i/>
+        </w:rPr>
+        <w:t>]</w:t>
+      </w:r>
+      <w:r>
+        <w:rPr>
+          <w:b w:val="0"/>
+          <w:i/>
+        </w:rPr>
+        <w:t>/</w:t>
+      </w:r>
+      <w:proofErr w:type="spellStart"/>
+      <w:r>
+        <w:rPr>
+          <w:b w:val="0"/>
+          <w:i/>
+        </w:rPr>
+        <w:t>src</w:t>
+      </w:r>
+      <w:proofErr w:type="spellEnd"/>
       <w:r>
         <w:rPr>
           <w:b w:val="0"/>
@@ -2516,6 +2989,7 @@
         <w:rPr>
           <w:noProof/>
         </w:rPr>
+        <w:lastRenderedPageBreak/>
         <w:drawing>
           <wp:inline distT="0" distB="0" distL="0" distR="0" wp14:anchorId="235C2AEF" wp14:editId="1DF6A99F">
             <wp:extent cx="5248275" cy="3422312"/>
@@ -2613,12 +3087,28 @@
         </w:rPr>
         <w:t xml:space="preserve">You will now add the constraints for the system. These files map the signal names to the pins on the board. For example, the LEDs on the </w:t>
       </w:r>
-      <w:r>
-        <w:rPr>
-          <w:b w:val="0"/>
-        </w:rPr>
-        <w:t>Nexys Video Video</w:t>
-      </w:r>
+      <w:proofErr w:type="spellStart"/>
+      <w:r>
+        <w:rPr>
+          <w:b w:val="0"/>
+        </w:rPr>
+        <w:t>Nexys</w:t>
+      </w:r>
+      <w:proofErr w:type="spellEnd"/>
+      <w:r>
+        <w:rPr>
+          <w:b w:val="0"/>
+        </w:rPr>
+        <w:t xml:space="preserve"> Video </w:t>
+      </w:r>
+      <w:proofErr w:type="spellStart"/>
+      <w:r>
+        <w:rPr>
+          <w:b w:val="0"/>
+        </w:rPr>
+        <w:t>Video</w:t>
+      </w:r>
+      <w:proofErr w:type="spellEnd"/>
       <w:r>
         <w:rPr>
           <w:b w:val="0"/>
@@ -2629,7 +3119,21 @@
         <w:rPr>
           <w:b w:val="0"/>
         </w:rPr>
-        <w:t xml:space="preserve"> board are connected to FPGA pins on the board through traces in the PCB. Vivado must know this so that it maps the correct signal name in the RTL to the </w:t>
+        <w:t xml:space="preserve"> board are connected to FPGA pins on the board through traces in the PCB. </w:t>
+      </w:r>
+      <w:proofErr w:type="spellStart"/>
+      <w:r>
+        <w:rPr>
+          <w:b w:val="0"/>
+        </w:rPr>
+        <w:t>Vivado</w:t>
+      </w:r>
+      <w:proofErr w:type="spellEnd"/>
+      <w:r>
+        <w:rPr>
+          <w:b w:val="0"/>
+        </w:rPr>
+        <w:t xml:space="preserve"> must know this so that it maps the correct signal name in the RTL to the </w:t>
       </w:r>
       <w:r>
         <w:rPr>
@@ -2659,6 +3163,7 @@
         </w:rPr>
         <w:t xml:space="preserve">Note that the signal name </w:t>
       </w:r>
+      <w:proofErr w:type="spellStart"/>
       <w:r>
         <w:rPr>
           <w:rFonts w:ascii="Courier New" w:hAnsi="Courier New" w:cs="Courier New"/>
@@ -2666,6 +3171,7 @@
         </w:rPr>
         <w:t>o_led</w:t>
       </w:r>
+      <w:proofErr w:type="spellEnd"/>
       <w:r>
         <w:rPr>
           <w:b w:val="0"/>
@@ -2684,12 +3190,28 @@
         </w:rPr>
         <w:t xml:space="preserve">Verilog code to drive the </w:t>
       </w:r>
-      <w:r>
-        <w:rPr>
-          <w:b w:val="0"/>
-        </w:rPr>
-        <w:t>Nexys Video Video</w:t>
-      </w:r>
+      <w:proofErr w:type="spellStart"/>
+      <w:r>
+        <w:rPr>
+          <w:b w:val="0"/>
+        </w:rPr>
+        <w:t>Nexys</w:t>
+      </w:r>
+      <w:proofErr w:type="spellEnd"/>
+      <w:r>
+        <w:rPr>
+          <w:b w:val="0"/>
+        </w:rPr>
+        <w:t xml:space="preserve"> Video </w:t>
+      </w:r>
+      <w:proofErr w:type="spellStart"/>
+      <w:r>
+        <w:rPr>
+          <w:b w:val="0"/>
+        </w:rPr>
+        <w:t>Video</w:t>
+      </w:r>
+      <w:proofErr w:type="spellEnd"/>
       <w:r>
         <w:rPr>
           <w:b w:val="0"/>
@@ -2812,22 +3334,39 @@
           <w:b w:val="0"/>
           <w:i/>
         </w:rPr>
-        <w:t>Nexys Video</w:t>
-      </w:r>
+        <w:t xml:space="preserve">Nexys </w:t>
+      </w:r>
+      <w:proofErr w:type="spellStart"/>
       <w:r>
         <w:rPr>
           <w:b w:val="0"/>
           <w:i/>
         </w:rPr>
-        <w:t>VideoNoDDRPath]</w:t>
+        <w:t>Video</w:t>
       </w:r>
       <w:r>
         <w:rPr>
           <w:b w:val="0"/>
           <w:i/>
         </w:rPr>
+        <w:t>VideoNoDDRPath</w:t>
+      </w:r>
+      <w:proofErr w:type="spellEnd"/>
+      <w:r>
+        <w:rPr>
+          <w:b w:val="0"/>
+          <w:i/>
+        </w:rPr>
+        <w:t>]</w:t>
+      </w:r>
+      <w:r>
+        <w:rPr>
+          <w:b w:val="0"/>
+          <w:i/>
+        </w:rPr>
         <w:t>/</w:t>
       </w:r>
+      <w:proofErr w:type="spellStart"/>
       <w:r>
         <w:rPr>
           <w:b w:val="0"/>
@@ -2835,6 +3374,7 @@
         </w:rPr>
         <w:t>src</w:t>
       </w:r>
+      <w:proofErr w:type="spellEnd"/>
       <w:r>
         <w:rPr>
           <w:b w:val="0"/>
@@ -2842,6 +3382,7 @@
         </w:rPr>
         <w:t>/</w:t>
       </w:r>
+      <w:proofErr w:type="spellStart"/>
       <w:r>
         <w:rPr>
           <w:b w:val="0"/>
@@ -2854,61 +3395,32 @@
           <w:b w:val="0"/>
           <w:i/>
         </w:rPr>
-        <w:t>Nexys Video</w:t>
-      </w:r>
+        <w:t>Nexys</w:t>
+      </w:r>
+      <w:proofErr w:type="spellEnd"/>
       <w:r>
         <w:rPr>
           <w:b w:val="0"/>
           <w:i/>
         </w:rPr>
+        <w:t xml:space="preserve"> </w:t>
+      </w:r>
+      <w:proofErr w:type="spellStart"/>
+      <w:r>
+        <w:rPr>
+          <w:b w:val="0"/>
+          <w:i/>
+        </w:rPr>
+        <w:t>Video</w:t>
+      </w:r>
+      <w:r>
+        <w:rPr>
+          <w:b w:val="0"/>
+          <w:i/>
+        </w:rPr>
         <w:t>.xdc</w:t>
       </w:r>
-    </w:p>
-    <w:p>
-      <w:pPr>
-        <w:pStyle w:val="a6"/>
-        <w:ind w:left="720"/>
-        <w:rPr>
-          <w:b w:val="0"/>
-          <w:i/>
-        </w:rPr>
-      </w:pPr>
-      <w:r>
-        <w:rPr>
-          <w:b w:val="0"/>
-          <w:i/>
-        </w:rPr>
-        <w:t>[RVfpgaEL2</w:t>
-      </w:r>
-      <w:r>
-        <w:rPr>
-          <w:b w:val="0"/>
-          <w:i/>
-        </w:rPr>
-        <w:t>Nexys Video</w:t>
-      </w:r>
-      <w:r>
-        <w:rPr>
-          <w:b w:val="0"/>
-          <w:i/>
-        </w:rPr>
-        <w:t>VideoNoDDRPath]</w:t>
-      </w:r>
-      <w:r>
-        <w:rPr>
-          <w:b w:val="0"/>
-          <w:i/>
-        </w:rPr>
-        <w:t>/src/LiteDRAM/liteDRAM.xdc</w:t>
-      </w:r>
-    </w:p>
-    <w:p>
-      <w:pPr>
-        <w:pStyle w:val="a6"/>
-        <w:rPr>
-          <w:b w:val="0"/>
-        </w:rPr>
-      </w:pPr>
+      <w:proofErr w:type="spellEnd"/>
     </w:p>
     <w:p>
       <w:pPr>
@@ -2938,6 +3450,87 @@
         <w:pStyle w:val="a6"/>
         <w:jc w:val="center"/>
       </w:pPr>
+      <w:r>
+        <w:rPr>
+          <w:noProof/>
+        </w:rPr>
+        <w:lastRenderedPageBreak/>
+        <mc:AlternateContent>
+          <mc:Choice Requires="wps">
+            <w:drawing>
+              <wp:anchor distT="0" distB="0" distL="114300" distR="114300" simplePos="0" relativeHeight="251659264" behindDoc="0" locked="0" layoutInCell="1" allowOverlap="1" wp14:anchorId="4C148EE2" wp14:editId="04A8C668">
+                <wp:simplePos x="0" y="0"/>
+                <wp:positionH relativeFrom="column">
+                  <wp:posOffset>354724</wp:posOffset>
+                </wp:positionH>
+                <wp:positionV relativeFrom="paragraph">
+                  <wp:posOffset>1332186</wp:posOffset>
+                </wp:positionV>
+                <wp:extent cx="3082159" cy="193215"/>
+                <wp:effectExtent l="0" t="0" r="4445" b="0"/>
+                <wp:wrapNone/>
+                <wp:docPr id="321604535" name="矩形 1"/>
+                <wp:cNvGraphicFramePr/>
+                <a:graphic xmlns:a="http://schemas.openxmlformats.org/drawingml/2006/main">
+                  <a:graphicData uri="http://schemas.microsoft.com/office/word/2010/wordprocessingShape">
+                    <wps:wsp>
+                      <wps:cNvSpPr/>
+                      <wps:spPr>
+                        <a:xfrm>
+                          <a:off x="0" y="0"/>
+                          <a:ext cx="3082159" cy="193215"/>
+                        </a:xfrm>
+                        <a:prstGeom prst="rect">
+                          <a:avLst/>
+                        </a:prstGeom>
+                        <a:solidFill>
+                          <a:srgbClr val="FBFBFB"/>
+                        </a:solidFill>
+                        <a:ln>
+                          <a:noFill/>
+                        </a:ln>
+                      </wps:spPr>
+                      <wps:style>
+                        <a:lnRef idx="2">
+                          <a:schemeClr val="accent1">
+                            <a:shade val="15000"/>
+                          </a:schemeClr>
+                        </a:lnRef>
+                        <a:fillRef idx="1">
+                          <a:schemeClr val="accent1"/>
+                        </a:fillRef>
+                        <a:effectRef idx="0">
+                          <a:schemeClr val="accent1"/>
+                        </a:effectRef>
+                        <a:fontRef idx="minor">
+                          <a:schemeClr val="lt1"/>
+                        </a:fontRef>
+                      </wps:style>
+                      <wps:bodyPr rot="0" spcFirstLastPara="0" vertOverflow="overflow" horzOverflow="overflow" vert="horz" wrap="square" lIns="91440" tIns="45720" rIns="91440" bIns="45720" numCol="1" spcCol="0" rtlCol="0" fromWordArt="0" anchor="ctr" anchorCtr="0" forceAA="0" compatLnSpc="1">
+                        <a:prstTxWarp prst="textNoShape">
+                          <a:avLst/>
+                        </a:prstTxWarp>
+                        <a:noAutofit/>
+                      </wps:bodyPr>
+                    </wps:wsp>
+                  </a:graphicData>
+                </a:graphic>
+                <wp14:sizeRelH relativeFrom="margin">
+                  <wp14:pctWidth>0</wp14:pctWidth>
+                </wp14:sizeRelH>
+                <wp14:sizeRelV relativeFrom="margin">
+                  <wp14:pctHeight>0</wp14:pctHeight>
+                </wp14:sizeRelV>
+              </wp:anchor>
+            </w:drawing>
+          </mc:Choice>
+          <mc:Fallback>
+            <w:pict>
+              <v:rect w14:anchorId="163D9F5A" id="矩形 1" o:spid="_x0000_s1026" style="position:absolute;margin-left:27.95pt;margin-top:104.9pt;width:242.7pt;height:15.2pt;z-index:251659264;visibility:visible;mso-wrap-style:square;mso-width-percent:0;mso-height-percent:0;mso-wrap-distance-left:9pt;mso-wrap-distance-top:0;mso-wrap-distance-right:9pt;mso-wrap-distance-bottom:0;mso-position-horizontal:absolute;mso-position-horizontal-relative:text;mso-position-vertical:absolute;mso-position-vertical-relative:text;mso-width-percent:0;mso-height-percent:0;mso-width-relative:margin;mso-height-relative:margin;v-text-anchor:middle" o:gfxdata="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" fillcolor="#fbfbfb" stroked="f" strokeweight="2pt"/>
+            </w:pict>
+          </mc:Fallback>
+        </mc:AlternateContent>
+      </w:r>
       <w:r>
         <w:rPr>
           <w:noProof/>
@@ -3045,6 +3638,7 @@
         </w:rPr>
         <w:t xml:space="preserve">Step 4. Select </w:t>
       </w:r>
+      <w:proofErr w:type="spellStart"/>
       <w:r>
         <w:rPr>
           <w:rFonts w:eastAsia="Times New Roman" w:cs="Arial"/>
@@ -3052,8 +3646,9 @@
           <w:bCs/>
           <w:color w:val="000000" w:themeColor="text1"/>
         </w:rPr>
-        <w:t>Nexys Video Video</w:t>
-      </w:r>
+        <w:t>Nexys</w:t>
+      </w:r>
+      <w:proofErr w:type="spellEnd"/>
       <w:r>
         <w:rPr>
           <w:rFonts w:eastAsia="Times New Roman" w:cs="Arial"/>
@@ -3061,6 +3656,26 @@
           <w:bCs/>
           <w:color w:val="000000" w:themeColor="text1"/>
         </w:rPr>
+        <w:t xml:space="preserve"> Video </w:t>
+      </w:r>
+      <w:proofErr w:type="spellStart"/>
+      <w:r>
+        <w:rPr>
+          <w:rFonts w:eastAsia="Times New Roman" w:cs="Arial"/>
+          <w:b/>
+          <w:bCs/>
+          <w:color w:val="000000" w:themeColor="text1"/>
+        </w:rPr>
+        <w:t>Video</w:t>
+      </w:r>
+      <w:proofErr w:type="spellEnd"/>
+      <w:r>
+        <w:rPr>
+          <w:rFonts w:eastAsia="Times New Roman" w:cs="Arial"/>
+          <w:b/>
+          <w:bCs/>
+          <w:color w:val="000000" w:themeColor="text1"/>
+        </w:rPr>
         <w:t xml:space="preserve"> board</w:t>
       </w:r>
       <w:r>
@@ -3124,47 +3739,23 @@
           <w:color w:val="000000"/>
           <w:lang w:val="en-US"/>
         </w:rPr>
-        <w:t xml:space="preserve">In the Default Part window, click on </w:t>
-      </w:r>
-      <w:r>
-        <w:rPr>
-          <w:rFonts w:eastAsia="Times New Roman" w:cs="Arial"/>
-          <w:color w:val="000000"/>
-          <w:lang w:val="en-US"/>
-        </w:rPr>
-        <w:t xml:space="preserve">Boards </w:t>
-      </w:r>
-      <w:r>
-        <w:rPr>
-          <w:rFonts w:eastAsia="Times New Roman" w:cs="Arial"/>
-          <w:color w:val="000000"/>
-          <w:lang w:val="en-US"/>
-        </w:rPr>
-        <w:t xml:space="preserve">and then select </w:t>
-      </w:r>
-      <w:r>
-        <w:rPr>
-          <w:rFonts w:eastAsia="Times New Roman" w:cs="Arial"/>
+        <w:t xml:space="preserve">In the Default Part window, select </w:t>
+      </w:r>
+      <w:r>
+        <w:rPr>
+          <w:rFonts w:cs="Arial" w:hint="eastAsia"/>
           <w:color w:val="000000" w:themeColor="text1"/>
-          <w:lang w:val="en-US"/>
-        </w:rPr>
-        <w:t>Nexys Video Video</w:t>
-      </w:r>
-      <w:r>
-        <w:rPr>
-          <w:rFonts w:eastAsia="Times New Roman" w:cs="Arial"/>
-          <w:color w:val="000000" w:themeColor="text1"/>
-          <w:lang w:val="en-US"/>
-        </w:rPr>
-        <w:t>-100T</w:t>
-      </w:r>
-      <w:r>
-        <w:rPr>
-          <w:rFonts w:eastAsia="Times New Roman" w:cs="Arial"/>
-          <w:color w:val="000000"/>
-          <w:lang w:val="en-US"/>
-        </w:rPr>
-        <w:t xml:space="preserve"> (see</w:t>
+          <w:lang w:val="en-US" w:eastAsia="zh-CN"/>
+        </w:rPr>
+        <w:t xml:space="preserve">xc7a200tsbg484-1 </w:t>
+      </w:r>
+      <w:r>
+        <w:rPr>
+          <w:rFonts w:eastAsia="Times New Roman" w:cs="Arial"/>
+          <w:color w:val="000000"/>
+          <w:lang w:val="en-US"/>
+        </w:rPr>
+        <w:t>(see</w:t>
       </w:r>
       <w:r>
         <w:rPr>
@@ -3253,9 +3844,9 @@
       <w:pPr>
         <w:textAlignment w:val="baseline"/>
         <w:rPr>
-          <w:rFonts w:eastAsia="Times New Roman" w:cs="Arial"/>
-          <w:color w:val="000000"/>
-          <w:lang w:val="en-US"/>
+          <w:rFonts w:cs="Arial" w:hint="eastAsia"/>
+          <w:color w:val="000000"/>
+          <w:lang w:val="en-US" w:eastAsia="zh-CN"/>
         </w:rPr>
       </w:pPr>
       <w:r>
@@ -3269,28 +3860,17 @@
     </w:p>
     <w:p>
       <w:pPr>
-        <w:textAlignment w:val="baseline"/>
-        <w:rPr>
-          <w:rFonts w:eastAsia="Times New Roman" w:cs="Arial"/>
+        <w:jc w:val="center"/>
+      </w:pPr>
+      <w:r>
+        <w:rPr>
           <w:noProof/>
-          <w:color w:val="000000" w:themeColor="text1"/>
-          <w:lang w:val="en-US"/>
-        </w:rPr>
-      </w:pPr>
-    </w:p>
-    <w:p>
-      <w:pPr>
-        <w:jc w:val="center"/>
-      </w:pPr>
-      <w:r>
-        <w:rPr>
-          <w:noProof/>
         </w:rPr>
         <w:drawing>
-          <wp:inline distT="0" distB="0" distL="0" distR="0" wp14:anchorId="280992C3" wp14:editId="01DBADF8">
-            <wp:extent cx="5505450" cy="3624421"/>
-            <wp:effectExtent l="0" t="0" r="0" b="0"/>
-            <wp:docPr id="1540130417" name="Picture 1540130417"/>
+          <wp:inline distT="0" distB="0" distL="0" distR="0" wp14:anchorId="770ED8D6" wp14:editId="1D828ACC">
+            <wp:extent cx="5731510" cy="1064260"/>
+            <wp:effectExtent l="0" t="0" r="2540" b="2540"/>
+            <wp:docPr id="406246844" name="图片 1" descr="图形用户界面, 文本, 应用程序, Word&#10;&#10;AI 生成的内容可能不正确。"/>
             <wp:cNvGraphicFramePr>
               <a:graphicFrameLocks xmlns:a="http://schemas.openxmlformats.org/drawingml/2006/main" noChangeAspect="1"/>
             </wp:cNvGraphicFramePr>
@@ -3298,17 +3878,11 @@
               <a:graphicData uri="http://schemas.openxmlformats.org/drawingml/2006/picture">
                 <pic:pic xmlns:pic="http://schemas.openxmlformats.org/drawingml/2006/picture">
                   <pic:nvPicPr>
-                    <pic:cNvPr id="0" name=""/>
+                    <pic:cNvPr id="406246844" name="图片 1" descr="图形用户界面, 文本, 应用程序, Word&#10;&#10;AI 生成的内容可能不正确。"/>
                     <pic:cNvPicPr/>
                   </pic:nvPicPr>
                   <pic:blipFill>
-                    <a:blip r:embed="rId15">
-                      <a:extLst>
-                        <a:ext uri="{28A0092B-C50C-407E-A947-70E740481C1C}">
-                          <a14:useLocalDpi xmlns:a14="http://schemas.microsoft.com/office/drawing/2010/main" val="0"/>
-                        </a:ext>
-                      </a:extLst>
-                    </a:blip>
+                    <a:blip r:embed="rId15"/>
                     <a:stretch>
                       <a:fillRect/>
                     </a:stretch>
@@ -3316,7 +3890,7 @@
                   <pic:spPr>
                     <a:xfrm>
                       <a:off x="0" y="0"/>
-                      <a:ext cx="5505450" cy="3624421"/>
+                      <a:ext cx="5731510" cy="1064260"/>
                     </a:xfrm>
                     <a:prstGeom prst="rect">
                       <a:avLst/>
@@ -3456,6 +4030,7 @@
         <w:rPr>
           <w:noProof/>
         </w:rPr>
+        <w:lastRenderedPageBreak/>
         <w:drawing>
           <wp:inline distT="0" distB="0" distL="0" distR="0" wp14:anchorId="40FAD89D" wp14:editId="23B15FEB">
             <wp:extent cx="4572000" cy="3371850"/>
@@ -3565,8 +4140,9 @@
           <w:bCs/>
           <w:color w:val="000000" w:themeColor="text1"/>
         </w:rPr>
-        <w:t>Step 5. Set rvfpga</w:t>
-      </w:r>
+        <w:t xml:space="preserve">Step 5. Set </w:t>
+      </w:r>
+      <w:proofErr w:type="spellStart"/>
       <w:r>
         <w:rPr>
           <w:rFonts w:eastAsia="Times New Roman" w:cs="Arial"/>
@@ -3574,7 +4150,7 @@
           <w:bCs/>
           <w:color w:val="000000" w:themeColor="text1"/>
         </w:rPr>
-        <w:t>Nexys Video</w:t>
+        <w:t>rvfpga</w:t>
       </w:r>
       <w:r>
         <w:rPr>
@@ -3583,6 +4159,25 @@
           <w:bCs/>
           <w:color w:val="000000" w:themeColor="text1"/>
         </w:rPr>
+        <w:t>Nexys</w:t>
+      </w:r>
+      <w:proofErr w:type="spellEnd"/>
+      <w:r>
+        <w:rPr>
+          <w:rFonts w:eastAsia="Times New Roman" w:cs="Arial"/>
+          <w:b/>
+          <w:bCs/>
+          <w:color w:val="000000" w:themeColor="text1"/>
+        </w:rPr>
+        <w:t xml:space="preserve"> Video</w:t>
+      </w:r>
+      <w:r>
+        <w:rPr>
+          <w:rFonts w:eastAsia="Times New Roman" w:cs="Arial"/>
+          <w:b/>
+          <w:bCs/>
+          <w:color w:val="000000" w:themeColor="text1"/>
+        </w:rPr>
         <w:t xml:space="preserve"> as Top Module, </w:t>
       </w:r>
       <w:r>
@@ -3594,6 +4189,7 @@
         </w:rPr>
         <w:t xml:space="preserve">set </w:t>
       </w:r>
+      <w:proofErr w:type="spellStart"/>
       <w:r>
         <w:rPr>
           <w:rFonts w:eastAsia="Times New Roman" w:cs="Arial"/>
@@ -3601,7 +4197,28 @@
           <w:bCs/>
           <w:color w:val="000000" w:themeColor="text1"/>
         </w:rPr>
-        <w:t xml:space="preserve">common_defines.vh as global, </w:t>
+        <w:t>common_</w:t>
+      </w:r>
+      <w:proofErr w:type="gramStart"/>
+      <w:r>
+        <w:rPr>
+          <w:rFonts w:eastAsia="Times New Roman" w:cs="Arial"/>
+          <w:b/>
+          <w:bCs/>
+          <w:color w:val="000000" w:themeColor="text1"/>
+        </w:rPr>
+        <w:t>defines.vh</w:t>
+      </w:r>
+      <w:proofErr w:type="spellEnd"/>
+      <w:proofErr w:type="gramEnd"/>
+      <w:r>
+        <w:rPr>
+          <w:rFonts w:eastAsia="Times New Roman" w:cs="Arial"/>
+          <w:b/>
+          <w:bCs/>
+          <w:color w:val="000000" w:themeColor="text1"/>
+        </w:rPr>
+        <w:t xml:space="preserve"> as global, </w:t>
       </w:r>
       <w:r>
         <w:rPr>
@@ -3641,6 +4258,7 @@
         </w:rPr>
         <w:t xml:space="preserve">, add </w:t>
       </w:r>
+      <w:proofErr w:type="spellStart"/>
       <w:r>
         <w:rPr>
           <w:rFonts w:eastAsia="Times New Roman" w:cs="Arial"/>
@@ -3652,6 +4270,7 @@
         </w:rPr>
         <w:t>boot_main.mem</w:t>
       </w:r>
+      <w:proofErr w:type="spellEnd"/>
       <w:r>
         <w:rPr>
           <w:rFonts w:eastAsia="Times New Roman" w:cs="Arial"/>
@@ -3752,15 +4371,16 @@
           <w:color w:val="000000"/>
           <w:u w:val="single"/>
         </w:rPr>
-        <w:t>Set rvfpga</w:t>
-      </w:r>
+        <w:t xml:space="preserve">Set </w:t>
+      </w:r>
+      <w:proofErr w:type="spellStart"/>
       <w:r>
         <w:rPr>
           <w:rFonts w:eastAsia="Times New Roman" w:cs="Arial"/>
           <w:color w:val="000000"/>
           <w:u w:val="single"/>
         </w:rPr>
-        <w:t>Nexys Video</w:t>
+        <w:t>rvfpga</w:t>
       </w:r>
       <w:r>
         <w:rPr>
@@ -3768,6 +4388,23 @@
           <w:color w:val="000000"/>
           <w:u w:val="single"/>
         </w:rPr>
+        <w:t>Nexys</w:t>
+      </w:r>
+      <w:proofErr w:type="spellEnd"/>
+      <w:r>
+        <w:rPr>
+          <w:rFonts w:eastAsia="Times New Roman" w:cs="Arial"/>
+          <w:color w:val="000000"/>
+          <w:u w:val="single"/>
+        </w:rPr>
+        <w:t xml:space="preserve"> Video</w:t>
+      </w:r>
+      <w:r>
+        <w:rPr>
+          <w:rFonts w:eastAsia="Times New Roman" w:cs="Arial"/>
+          <w:color w:val="000000"/>
+          <w:u w:val="single"/>
+        </w:rPr>
         <w:t xml:space="preserve"> as </w:t>
       </w:r>
       <w:r>
@@ -3834,6 +4471,7 @@
         </w:rPr>
         <w:t xml:space="preserve">the </w:t>
       </w:r>
+      <w:proofErr w:type="spellStart"/>
       <w:r>
         <w:rPr>
           <w:rFonts w:ascii="Courier New" w:eastAsia="Times New Roman" w:hAnsi="Courier New" w:cs="Courier New"/>
@@ -3841,59 +4479,182 @@
           <w:color w:val="000000"/>
           <w:lang w:val="en-US"/>
         </w:rPr>
-        <w:t>rvfpga</w:t>
-      </w:r>
+        <w:t>rvfpganexys</w:t>
+      </w:r>
+      <w:proofErr w:type="spellEnd"/>
+      <w:r>
+        <w:rPr>
+          <w:rFonts w:ascii="Courier New" w:hAnsi="Courier New" w:cs="Courier New" w:hint="eastAsia"/>
+          <w:b w:val="0"/>
+          <w:color w:val="000000" w:themeColor="text1"/>
+          <w:lang w:val="en-US" w:eastAsia="zh-CN"/>
+        </w:rPr>
+        <w:t xml:space="preserve"> </w:t>
+      </w:r>
+      <w:r>
+        <w:rPr>
+          <w:rFonts w:eastAsia="Times New Roman" w:cs="Arial"/>
+          <w:b w:val="0"/>
+          <w:color w:val="000000"/>
+          <w:lang w:val="en-US"/>
+        </w:rPr>
+        <w:t>module</w:t>
+      </w:r>
+      <w:r>
+        <w:rPr>
+          <w:rFonts w:eastAsia="Times New Roman" w:cs="Arial"/>
+          <w:b w:val="0"/>
+          <w:color w:val="000000"/>
+          <w:lang w:val="en-US"/>
+        </w:rPr>
+        <w:t>,</w:t>
+      </w:r>
+      <w:r>
+        <w:rPr>
+          <w:rFonts w:eastAsia="Times New Roman" w:cs="Arial"/>
+          <w:b w:val="0"/>
+          <w:color w:val="000000"/>
+          <w:lang w:val="en-US"/>
+        </w:rPr>
+        <w:t xml:space="preserve"> and select Set as Top </w:t>
+      </w:r>
+      <w:r>
+        <w:rPr>
+          <w:rFonts w:eastAsia="Times New Roman" w:cs="Arial"/>
+          <w:b w:val="0"/>
+          <w:color w:val="000000"/>
+          <w:lang w:val="en-US"/>
+        </w:rPr>
+        <w:t>(see</w:t>
+      </w:r>
+      <w:r>
+        <w:rPr>
+          <w:rFonts w:eastAsia="Times New Roman" w:cs="Arial"/>
+          <w:b w:val="0"/>
+          <w:color w:val="000000"/>
+          <w:lang w:val="en-US"/>
+        </w:rPr>
+        <w:t xml:space="preserve"> </w:t>
+      </w:r>
+      <w:r>
+        <w:rPr>
+          <w:rFonts w:eastAsia="Times New Roman" w:cs="Arial"/>
+          <w:b w:val="0"/>
+          <w:color w:val="000000"/>
+          <w:lang w:val="en-US"/>
+        </w:rPr>
+        <w:fldChar w:fldCharType="begin"/>
+      </w:r>
+      <w:r>
+        <w:rPr>
+          <w:rFonts w:eastAsia="Times New Roman" w:cs="Arial"/>
+          <w:b w:val="0"/>
+          <w:color w:val="000000"/>
+          <w:lang w:val="en-US"/>
+        </w:rPr>
+        <w:instrText xml:space="preserve"> REF _Ref54518023 \h  \* MERGEFORMAT </w:instrText>
+      </w:r>
+      <w:r>
+        <w:rPr>
+          <w:rFonts w:eastAsia="Times New Roman" w:cs="Arial"/>
+          <w:b w:val="0"/>
+          <w:color w:val="000000"/>
+          <w:lang w:val="en-US"/>
+        </w:rPr>
+      </w:r>
+      <w:r>
+        <w:rPr>
+          <w:rFonts w:eastAsia="Times New Roman" w:cs="Arial"/>
+          <w:b w:val="0"/>
+          <w:color w:val="000000"/>
+          <w:lang w:val="en-US"/>
+        </w:rPr>
+        <w:fldChar w:fldCharType="separate"/>
+      </w:r>
+      <w:r>
+        <w:rPr>
+          <w:b w:val="0"/>
+        </w:rPr>
+        <w:t xml:space="preserve">Figure </w:t>
+      </w:r>
+      <w:r>
+        <w:rPr>
+          <w:b w:val="0"/>
+          <w:noProof/>
+        </w:rPr>
+        <w:t>9</w:t>
+      </w:r>
+      <w:r>
+        <w:rPr>
+          <w:rFonts w:eastAsia="Times New Roman" w:cs="Arial"/>
+          <w:b w:val="0"/>
+          <w:color w:val="000000"/>
+          <w:lang w:val="en-US"/>
+        </w:rPr>
+        <w:fldChar w:fldCharType="end"/>
+      </w:r>
+      <w:r>
+        <w:rPr>
+          <w:rFonts w:eastAsia="Times New Roman" w:cs="Arial"/>
+          <w:b w:val="0"/>
+          <w:color w:val="000000"/>
+          <w:lang w:val="en-US"/>
+        </w:rPr>
+        <w:t>)</w:t>
+      </w:r>
+      <w:r>
+        <w:rPr>
+          <w:rFonts w:eastAsia="Times New Roman" w:cs="Arial"/>
+          <w:b w:val="0"/>
+          <w:color w:val="000000"/>
+          <w:lang w:val="en-US"/>
+        </w:rPr>
+        <w:t>.</w:t>
+      </w:r>
+      <w:r>
+        <w:rPr>
+          <w:rFonts w:eastAsia="Times New Roman" w:cs="Arial"/>
+          <w:b w:val="0"/>
+          <w:color w:val="000000"/>
+          <w:lang w:val="en-US"/>
+        </w:rPr>
+        <w:t xml:space="preserve"> </w:t>
+      </w:r>
+      <w:r>
+        <w:rPr>
+          <w:rFonts w:eastAsia="Times New Roman" w:cs="Arial"/>
+          <w:b w:val="0"/>
+          <w:color w:val="000000"/>
+          <w:lang w:val="en-US"/>
+        </w:rPr>
+        <w:t>(</w:t>
+      </w:r>
+      <w:r>
+        <w:rPr>
+          <w:rFonts w:eastAsia="Times New Roman" w:cs="Arial"/>
+          <w:b w:val="0"/>
+          <w:color w:val="000000"/>
+          <w:lang w:val="en-US"/>
+        </w:rPr>
+        <w:t xml:space="preserve">You can also find the </w:t>
+      </w:r>
+      <w:proofErr w:type="spellStart"/>
       <w:r>
         <w:rPr>
           <w:rFonts w:ascii="Courier New" w:eastAsia="Times New Roman" w:hAnsi="Courier New" w:cs="Courier New"/>
           <w:b w:val="0"/>
+          <w:color w:val="000000"/>
+          <w:lang w:val="en-US"/>
+        </w:rPr>
+        <w:t>rvfpganexys</w:t>
+      </w:r>
+      <w:proofErr w:type="spellEnd"/>
+      <w:r>
+        <w:rPr>
+          <w:rFonts w:ascii="Courier New" w:hAnsi="Courier New" w:cs="Courier New" w:hint="eastAsia"/>
+          <w:b w:val="0"/>
           <w:color w:val="000000" w:themeColor="text1"/>
-          <w:lang w:val="en-US"/>
-        </w:rPr>
-        <w:t>Nexys Video</w:t>
-      </w:r>
-      <w:r>
-        <w:rPr>
-          <w:rFonts w:eastAsia="Times New Roman" w:cs="Arial"/>
-          <w:b w:val="0"/>
-          <w:color w:val="000000"/>
-          <w:lang w:val="en-US"/>
-        </w:rPr>
-        <w:t xml:space="preserve"> module</w:t>
-      </w:r>
-      <w:r>
-        <w:rPr>
-          <w:rFonts w:eastAsia="Times New Roman" w:cs="Arial"/>
-          <w:b w:val="0"/>
-          <w:color w:val="000000"/>
-          <w:lang w:val="en-US"/>
-        </w:rPr>
-        <w:t>,</w:t>
-      </w:r>
-      <w:r>
-        <w:rPr>
-          <w:rFonts w:eastAsia="Times New Roman" w:cs="Arial"/>
-          <w:b w:val="0"/>
-          <w:color w:val="000000"/>
-          <w:lang w:val="en-US"/>
-        </w:rPr>
-        <w:t xml:space="preserve"> and select Set as Top </w:t>
-      </w:r>
-      <w:r>
-        <w:rPr>
-          <w:rFonts w:eastAsia="Times New Roman" w:cs="Arial"/>
-          <w:b w:val="0"/>
-          <w:color w:val="000000"/>
-          <w:lang w:val="en-US"/>
-        </w:rPr>
-        <w:t>(see</w:t>
-      </w:r>
-      <w:r>
-        <w:rPr>
-          <w:rFonts w:eastAsia="Times New Roman" w:cs="Arial"/>
-          <w:b w:val="0"/>
-          <w:color w:val="000000"/>
-          <w:lang w:val="en-US"/>
+          <w:lang w:val="en-US" w:eastAsia="zh-CN"/>
         </w:rPr>
         <w:t xml:space="preserve"> </w:t>
       </w:r>
@@ -3904,55 +4665,7 @@
           <w:color w:val="000000"/>
           <w:lang w:val="en-US"/>
         </w:rPr>
-        <w:fldChar w:fldCharType="begin"/>
-      </w:r>
-      <w:r>
-        <w:rPr>
-          <w:rFonts w:eastAsia="Times New Roman" w:cs="Arial"/>
-          <w:b w:val="0"/>
-          <w:color w:val="000000"/>
-          <w:lang w:val="en-US"/>
-        </w:rPr>
-        <w:instrText xml:space="preserve"> REF _Ref54518023 \h  \* MERGEFORMAT </w:instrText>
-      </w:r>
-      <w:r>
-        <w:rPr>
-          <w:rFonts w:eastAsia="Times New Roman" w:cs="Arial"/>
-          <w:b w:val="0"/>
-          <w:color w:val="000000"/>
-          <w:lang w:val="en-US"/>
-        </w:rPr>
-      </w:r>
-      <w:r>
-        <w:rPr>
-          <w:rFonts w:eastAsia="Times New Roman" w:cs="Arial"/>
-          <w:b w:val="0"/>
-          <w:color w:val="000000"/>
-          <w:lang w:val="en-US"/>
-        </w:rPr>
-        <w:fldChar w:fldCharType="separate"/>
-      </w:r>
-      <w:r>
-        <w:rPr>
-          <w:b w:val="0"/>
-        </w:rPr>
-        <w:t xml:space="preserve">Figure </w:t>
-      </w:r>
-      <w:r>
-        <w:rPr>
-          <w:b w:val="0"/>
-          <w:noProof/>
-        </w:rPr>
-        <w:t>9</w:t>
-      </w:r>
-      <w:r>
-        <w:rPr>
-          <w:rFonts w:eastAsia="Times New Roman" w:cs="Arial"/>
-          <w:b w:val="0"/>
-          <w:color w:val="000000"/>
-          <w:lang w:val="en-US"/>
-        </w:rPr>
-        <w:fldChar w:fldCharType="end"/>
+        <w:t>module by typing this name in the search box, as shown.</w:t>
       </w:r>
       <w:r>
         <w:rPr>
@@ -3970,15 +4683,6 @@
           <w:color w:val="000000"/>
           <w:lang w:val="en-US"/>
         </w:rPr>
-        <w:t>.</w:t>
-      </w:r>
-      <w:r>
-        <w:rPr>
-          <w:rFonts w:eastAsia="Times New Roman" w:cs="Arial"/>
-          <w:b w:val="0"/>
-          <w:color w:val="000000"/>
-          <w:lang w:val="en-US"/>
-        </w:rPr>
         <w:t xml:space="preserve"> </w:t>
       </w:r>
       <w:r>
@@ -3988,17 +4692,9 @@
           <w:color w:val="000000"/>
           <w:lang w:val="en-US"/>
         </w:rPr>
-        <w:t>(</w:t>
-      </w:r>
-      <w:r>
-        <w:rPr>
-          <w:rFonts w:eastAsia="Times New Roman" w:cs="Arial"/>
-          <w:b w:val="0"/>
-          <w:color w:val="000000"/>
-          <w:lang w:val="en-US"/>
-        </w:rPr>
-        <w:t xml:space="preserve">You can also find the </w:t>
-      </w:r>
+        <w:t xml:space="preserve">This sets </w:t>
+      </w:r>
+      <w:proofErr w:type="spellStart"/>
       <w:r>
         <w:rPr>
           <w:rFonts w:ascii="Courier New" w:eastAsia="Times New Roman" w:hAnsi="Courier New" w:cs="Courier New"/>
@@ -4006,41 +4702,62 @@
           <w:color w:val="000000"/>
           <w:lang w:val="en-US"/>
         </w:rPr>
-        <w:t>rvfpga</w:t>
-      </w:r>
+        <w:t>rvfpganexys</w:t>
+      </w:r>
+      <w:proofErr w:type="spellEnd"/>
+      <w:r>
+        <w:rPr>
+          <w:rFonts w:ascii="Courier New" w:hAnsi="Courier New" w:cs="Courier New" w:hint="eastAsia"/>
+          <w:b w:val="0"/>
+          <w:color w:val="000000" w:themeColor="text1"/>
+          <w:lang w:val="en-US" w:eastAsia="zh-CN"/>
+        </w:rPr>
+        <w:t xml:space="preserve"> </w:t>
+      </w:r>
+      <w:r>
+        <w:rPr>
+          <w:rFonts w:eastAsia="Times New Roman" w:cs="Arial"/>
+          <w:b w:val="0"/>
+          <w:color w:val="000000"/>
+          <w:lang w:val="en-US"/>
+        </w:rPr>
+        <w:t>as the highest-level module in the hierarchy and the target to be synthesized and implemented onto the FPGA.</w:t>
+      </w:r>
+      <w:r>
+        <w:rPr>
+          <w:rFonts w:eastAsia="Times New Roman" w:cs="Arial"/>
+          <w:b w:val="0"/>
+          <w:color w:val="000000"/>
+          <w:lang w:val="en-US"/>
+        </w:rPr>
+        <w:t xml:space="preserve"> </w:t>
+      </w:r>
+      <w:r>
+        <w:rPr>
+          <w:rFonts w:eastAsia="Times New Roman" w:cs="Arial"/>
+          <w:b w:val="0"/>
+          <w:color w:val="000000"/>
+          <w:lang w:val="en-US"/>
+        </w:rPr>
+        <w:t xml:space="preserve">After setting </w:t>
+      </w:r>
+      <w:proofErr w:type="spellStart"/>
       <w:r>
         <w:rPr>
           <w:rFonts w:ascii="Courier New" w:eastAsia="Times New Roman" w:hAnsi="Courier New" w:cs="Courier New"/>
           <w:b w:val="0"/>
+          <w:color w:val="000000"/>
+          <w:lang w:val="en-US"/>
+        </w:rPr>
+        <w:t>rvfpganexys</w:t>
+      </w:r>
+      <w:proofErr w:type="spellEnd"/>
+      <w:r>
+        <w:rPr>
+          <w:rFonts w:ascii="Courier New" w:hAnsi="Courier New" w:cs="Courier New" w:hint="eastAsia"/>
+          <w:b w:val="0"/>
           <w:color w:val="000000" w:themeColor="text1"/>
-          <w:lang w:val="en-US"/>
-        </w:rPr>
-        <w:t>Nexys Video</w:t>
-      </w:r>
-      <w:r>
-        <w:rPr>
-          <w:rFonts w:eastAsia="Times New Roman" w:cs="Arial"/>
-          <w:b w:val="0"/>
-          <w:color w:val="000000"/>
-          <w:lang w:val="en-US"/>
-        </w:rPr>
-        <w:t xml:space="preserve"> module by typing this name in the search box, as shown.</w:t>
-      </w:r>
-      <w:r>
-        <w:rPr>
-          <w:rFonts w:eastAsia="Times New Roman" w:cs="Arial"/>
-          <w:b w:val="0"/>
-          <w:color w:val="000000"/>
-          <w:lang w:val="en-US"/>
-        </w:rPr>
-        <w:t>)</w:t>
-      </w:r>
-      <w:r>
-        <w:rPr>
-          <w:rFonts w:eastAsia="Times New Roman" w:cs="Arial"/>
-          <w:b w:val="0"/>
-          <w:color w:val="000000"/>
-          <w:lang w:val="en-US"/>
+          <w:lang w:val="en-US" w:eastAsia="zh-CN"/>
         </w:rPr>
         <w:t xml:space="preserve"> </w:t>
       </w:r>
@@ -4051,79 +4768,7 @@
           <w:color w:val="000000"/>
           <w:lang w:val="en-US"/>
         </w:rPr>
-        <w:t xml:space="preserve">This sets </w:t>
-      </w:r>
-      <w:r>
-        <w:rPr>
-          <w:rFonts w:ascii="Courier New" w:eastAsia="Times New Roman" w:hAnsi="Courier New" w:cs="Courier New"/>
-          <w:b w:val="0"/>
-          <w:color w:val="000000"/>
-          <w:lang w:val="en-US"/>
-        </w:rPr>
-        <w:t>rvfpga</w:t>
-      </w:r>
-      <w:r>
-        <w:rPr>
-          <w:rFonts w:ascii="Courier New" w:eastAsia="Times New Roman" w:hAnsi="Courier New" w:cs="Courier New"/>
-          <w:b w:val="0"/>
-          <w:color w:val="000000"/>
-          <w:lang w:val="en-US"/>
-        </w:rPr>
-        <w:t>Nexys Video</w:t>
-      </w:r>
-      <w:r>
-        <w:rPr>
-          <w:rFonts w:eastAsia="Times New Roman" w:cs="Arial"/>
-          <w:b w:val="0"/>
-          <w:color w:val="000000"/>
-          <w:lang w:val="en-US"/>
-        </w:rPr>
-        <w:t xml:space="preserve"> as the highest-level module in the hierarchy and the target to be synthesized and implemented onto the FPGA.</w:t>
-      </w:r>
-      <w:r>
-        <w:rPr>
-          <w:rFonts w:eastAsia="Times New Roman" w:cs="Arial"/>
-          <w:b w:val="0"/>
-          <w:color w:val="000000"/>
-          <w:lang w:val="en-US"/>
-        </w:rPr>
-        <w:t xml:space="preserve"> </w:t>
-      </w:r>
-      <w:r>
-        <w:rPr>
-          <w:rFonts w:eastAsia="Times New Roman" w:cs="Arial"/>
-          <w:b w:val="0"/>
-          <w:color w:val="000000"/>
-          <w:lang w:val="en-US"/>
-        </w:rPr>
-        <w:t xml:space="preserve">After setting </w:t>
-      </w:r>
-      <w:r>
-        <w:rPr>
-          <w:rFonts w:ascii="Courier New" w:eastAsia="Times New Roman" w:hAnsi="Courier New" w:cs="Courier New"/>
-          <w:b w:val="0"/>
-          <w:color w:val="000000"/>
-          <w:lang w:val="en-US"/>
-        </w:rPr>
-        <w:t>rvfpga</w:t>
-      </w:r>
-      <w:r>
-        <w:rPr>
-          <w:rFonts w:ascii="Courier New" w:eastAsia="Times New Roman" w:hAnsi="Courier New" w:cs="Courier New"/>
-          <w:b w:val="0"/>
-          <w:color w:val="000000" w:themeColor="text1"/>
-          <w:lang w:val="en-US"/>
-        </w:rPr>
-        <w:t>Nexys Video</w:t>
-      </w:r>
-      <w:r>
-        <w:rPr>
-          <w:rFonts w:eastAsia="Times New Roman" w:cs="Arial"/>
-          <w:b w:val="0"/>
-          <w:color w:val="000000"/>
-          <w:lang w:val="en-US"/>
-        </w:rPr>
-        <w:t xml:space="preserve"> as the top module, t</w:t>
+        <w:t>as the top module, t</w:t>
       </w:r>
       <w:r>
         <w:rPr>
@@ -4165,6 +4810,7 @@
         <w:rPr>
           <w:noProof/>
         </w:rPr>
+        <w:lastRenderedPageBreak/>
         <w:drawing>
           <wp:inline distT="0" distB="0" distL="0" distR="0" wp14:anchorId="586A5AD1" wp14:editId="35E92ED6">
             <wp:extent cx="4352925" cy="4759462"/>
@@ -4246,10 +4892,18 @@
         <w:t xml:space="preserve">. </w:t>
       </w:r>
       <w:r>
-        <w:t>Set rvfpga</w:t>
-      </w:r>
-      <w:r>
-        <w:t>Nexys Video</w:t>
+        <w:t xml:space="preserve">Set </w:t>
+      </w:r>
+      <w:proofErr w:type="spellStart"/>
+      <w:r>
+        <w:t>rvfpga</w:t>
+      </w:r>
+      <w:r>
+        <w:t>Nexys</w:t>
+      </w:r>
+      <w:proofErr w:type="spellEnd"/>
+      <w:r>
+        <w:t xml:space="preserve"> Video</w:t>
       </w:r>
       <w:r>
         <w:t xml:space="preserve"> as top module</w:t>
@@ -4308,6 +4962,7 @@
         </w:rPr>
         <w:t xml:space="preserve"> </w:t>
       </w:r>
+      <w:proofErr w:type="spellStart"/>
       <w:r>
         <w:rPr>
           <w:rFonts w:eastAsia="Times New Roman" w:cs="Arial"/>
@@ -4318,8 +4973,23 @@
           <w:color w:val="000000"/>
           <w:u w:val="single"/>
         </w:rPr>
-        <w:t>common_defines.vh</w:t>
-      </w:r>
+        <w:t>common_</w:t>
+      </w:r>
+      <w:proofErr w:type="gramStart"/>
+      <w:r>
+        <w:rPr>
+          <w:rFonts w:eastAsia="Times New Roman" w:cs="Arial"/>
+          <w:b/>
+          <w:bCs/>
+          <w:i/>
+          <w:iCs/>
+          <w:color w:val="000000"/>
+          <w:u w:val="single"/>
+        </w:rPr>
+        <w:t>defines.vh</w:t>
+      </w:r>
+      <w:proofErr w:type="spellEnd"/>
+      <w:proofErr w:type="gramEnd"/>
       <w:r>
         <w:rPr>
           <w:rFonts w:eastAsia="Times New Roman" w:cs="Arial"/>
@@ -4412,8 +5082,20 @@
           <w:color w:val="000000" w:themeColor="text1"/>
           <w:u w:val="single"/>
         </w:rPr>
-        <w:t xml:space="preserve"> as SystemVerilog</w:t>
-      </w:r>
+        <w:t xml:space="preserve"> as </w:t>
+      </w:r>
+      <w:proofErr w:type="spellStart"/>
+      <w:r>
+        <w:rPr>
+          <w:rFonts w:eastAsia="Times New Roman" w:cs="Arial"/>
+          <w:b/>
+          <w:bCs/>
+          <w:color w:val="000000" w:themeColor="text1"/>
+          <w:u w:val="single"/>
+        </w:rPr>
+        <w:t>SystemVerilog</w:t>
+      </w:r>
+      <w:proofErr w:type="spellEnd"/>
       <w:r>
         <w:rPr>
           <w:rFonts w:eastAsia="Times New Roman" w:cs="Arial"/>
@@ -4448,13 +5130,23 @@
         </w:rPr>
         <w:t xml:space="preserve">, still in the Sources pane under Design Sources, expand the </w:t>
       </w:r>
-      <w:r>
-        <w:rPr>
-          <w:rFonts w:eastAsia="Times New Roman" w:cs="Arial"/>
-          <w:color w:val="000000"/>
-          <w:lang w:val="en-US"/>
-        </w:rPr>
-        <w:t>Non-modules file</w:t>
+      <w:proofErr w:type="gramStart"/>
+      <w:r>
+        <w:rPr>
+          <w:rFonts w:eastAsia="Times New Roman" w:cs="Arial"/>
+          <w:color w:val="000000"/>
+          <w:lang w:val="en-US"/>
+        </w:rPr>
+        <w:t>Non-modules</w:t>
+      </w:r>
+      <w:proofErr w:type="gramEnd"/>
+      <w:r>
+        <w:rPr>
+          <w:rFonts w:eastAsia="Times New Roman" w:cs="Arial"/>
+          <w:color w:val="000000"/>
+          <w:lang w:val="en-US"/>
+        </w:rPr>
+        <w:t xml:space="preserve"> file</w:t>
       </w:r>
       <w:r>
         <w:rPr>
@@ -4496,6 +5188,7 @@
         </w:rPr>
         <w:t xml:space="preserve"> </w:t>
       </w:r>
+      <w:proofErr w:type="spellStart"/>
       <w:r>
         <w:rPr>
           <w:rFonts w:eastAsia="Times New Roman" w:cs="Arial"/>
@@ -4506,6 +5199,7 @@
         </w:rPr>
         <w:t>common_defines.vh</w:t>
       </w:r>
+      <w:proofErr w:type="spellEnd"/>
       <w:r>
         <w:rPr>
           <w:rFonts w:eastAsia="Times New Roman" w:cs="Arial"/>
@@ -4740,6 +5434,7 @@
         <w:rPr>
           <w:noProof/>
         </w:rPr>
+        <w:lastRenderedPageBreak/>
         <w:t xml:space="preserve"> </w:t>
       </w:r>
       <w:r>
@@ -4861,6 +5556,7 @@
         </w:rPr>
         <w:t xml:space="preserve">. Set </w:t>
       </w:r>
+      <w:proofErr w:type="spellStart"/>
       <w:r>
         <w:rPr>
           <w:b/>
@@ -4868,8 +5564,20 @@
           <w:i/>
           <w:iCs/>
         </w:rPr>
-        <w:t>common_defines.vh</w:t>
-      </w:r>
+        <w:t>common_</w:t>
+      </w:r>
+      <w:proofErr w:type="gramStart"/>
+      <w:r>
+        <w:rPr>
+          <w:b/>
+          <w:bCs/>
+          <w:i/>
+          <w:iCs/>
+        </w:rPr>
+        <w:t>defines.vh</w:t>
+      </w:r>
+      <w:proofErr w:type="spellEnd"/>
+      <w:proofErr w:type="gramEnd"/>
       <w:r>
         <w:rPr>
           <w:b/>
@@ -4922,7 +5630,25 @@
           <w:color w:val="000000" w:themeColor="text1"/>
           <w:lang w:val="en-US"/>
         </w:rPr>
-        <w:t>. Then, on the same Window (Source File Properties), set the type of this file as SystemVerilog (see</w:t>
+        <w:t xml:space="preserve">. Then, on the same Window (Source File Properties), set the type of this file as </w:t>
+      </w:r>
+      <w:proofErr w:type="spellStart"/>
+      <w:r>
+        <w:rPr>
+          <w:rFonts w:eastAsia="Times New Roman" w:cs="Arial"/>
+          <w:color w:val="000000" w:themeColor="text1"/>
+          <w:lang w:val="en-US"/>
+        </w:rPr>
+        <w:t>SystemVerilog</w:t>
+      </w:r>
+      <w:proofErr w:type="spellEnd"/>
+      <w:r>
+        <w:rPr>
+          <w:rFonts w:eastAsia="Times New Roman" w:cs="Arial"/>
+          <w:color w:val="000000" w:themeColor="text1"/>
+          <w:lang w:val="en-US"/>
+        </w:rPr>
+        <w:t xml:space="preserve"> (see</w:t>
       </w:r>
       <w:r>
         <w:rPr>
@@ -5007,6 +5733,7 @@
         <w:rPr>
           <w:noProof/>
         </w:rPr>
+        <w:lastRenderedPageBreak/>
         <w:drawing>
           <wp:inline distT="0" distB="0" distL="0" distR="0" wp14:anchorId="501A71E1" wp14:editId="7A199F99">
             <wp:extent cx="4572000" cy="3971925"/>
@@ -5094,17 +5821,30 @@
         <w:rPr>
           <w:i/>
         </w:rPr>
-        <w:t>el2_pdf</w:t>
-      </w:r>
+        <w:t>el2_</w:t>
+      </w:r>
+      <w:proofErr w:type="gramStart"/>
       <w:r>
         <w:rPr>
           <w:i/>
         </w:rPr>
+        <w:t>pdf</w:t>
+      </w:r>
+      <w:r>
+        <w:rPr>
+          <w:i/>
+        </w:rPr>
         <w:t>.vh</w:t>
       </w:r>
-      <w:r>
-        <w:t xml:space="preserve"> as SystemVerilog</w:t>
-      </w:r>
+      <w:proofErr w:type="gramEnd"/>
+      <w:r>
+        <w:t xml:space="preserve"> as </w:t>
+      </w:r>
+      <w:proofErr w:type="spellStart"/>
+      <w:r>
+        <w:t>SystemVerilog</w:t>
+      </w:r>
+      <w:proofErr w:type="spellEnd"/>
     </w:p>
     <w:p>
       <w:pPr>
@@ -5133,6 +5873,7 @@
         </w:rPr>
         <w:t xml:space="preserve">Add </w:t>
       </w:r>
+      <w:proofErr w:type="spellStart"/>
       <w:r>
         <w:rPr>
           <w:rFonts w:eastAsia="Times New Roman" w:cs="Arial"/>
@@ -5145,6 +5886,7 @@
         </w:rPr>
         <w:t>boot_main.mem</w:t>
       </w:r>
+      <w:proofErr w:type="spellEnd"/>
       <w:r>
         <w:rPr>
           <w:rFonts w:eastAsia="Times New Roman" w:cs="Arial"/>
@@ -5297,15 +6039,16 @@
           <w:i/>
           <w:iCs/>
         </w:rPr>
-        <w:t>Nexys Video</w:t>
-      </w:r>
+        <w:t xml:space="preserve">Nexys </w:t>
+      </w:r>
+      <w:proofErr w:type="spellStart"/>
       <w:r>
         <w:rPr>
           <w:rFonts w:cs="Arial"/>
           <w:i/>
           <w:iCs/>
         </w:rPr>
-        <w:t>VideoNoDDRPath]</w:t>
+        <w:t>Video</w:t>
       </w:r>
       <w:r>
         <w:rPr>
@@ -5313,28 +6056,26 @@
           <w:i/>
           <w:iCs/>
         </w:rPr>
-        <w:t>/</w:t>
-      </w:r>
-      <w:r>
-        <w:rPr>
-          <w:rFonts w:eastAsia="Times New Roman" w:cs="Arial"/>
+        <w:t>VideoNoDDRPath</w:t>
+      </w:r>
+      <w:proofErr w:type="spellEnd"/>
+      <w:r>
+        <w:rPr>
+          <w:rFonts w:cs="Arial"/>
           <w:i/>
           <w:iCs/>
-          <w:color w:val="000000"/>
-          <w:lang w:val="en-US"/>
-        </w:rPr>
-        <w:t>src/</w:t>
-      </w:r>
-      <w:r>
-        <w:rPr>
-          <w:rFonts w:eastAsia="Times New Roman" w:cs="Arial"/>
+        </w:rPr>
+        <w:t>]</w:t>
+      </w:r>
+      <w:r>
+        <w:rPr>
+          <w:rFonts w:cs="Arial"/>
           <w:i/>
           <w:iCs/>
-          <w:color w:val="000000"/>
-          <w:lang w:val="en-US"/>
-        </w:rPr>
-        <w:t>VeeRwolf</w:t>
-      </w:r>
+        </w:rPr>
+        <w:t>/</w:t>
+      </w:r>
+      <w:proofErr w:type="spellStart"/>
       <w:r>
         <w:rPr>
           <w:rFonts w:eastAsia="Times New Roman" w:cs="Arial"/>
@@ -5343,16 +6084,9 @@
           <w:color w:val="000000"/>
           <w:lang w:val="en-US"/>
         </w:rPr>
-        <w:t xml:space="preserve">/BootROM/sw </w:t>
-      </w:r>
-      <w:r>
-        <w:rPr>
-          <w:rFonts w:eastAsia="Times New Roman" w:cs="Arial"/>
-          <w:color w:val="000000"/>
-          <w:lang w:val="en-US"/>
-        </w:rPr>
-        <w:t xml:space="preserve">and select </w:t>
-      </w:r>
+        <w:t>src</w:t>
+      </w:r>
+      <w:proofErr w:type="spellEnd"/>
       <w:r>
         <w:rPr>
           <w:rFonts w:eastAsia="Times New Roman" w:cs="Arial"/>
@@ -5361,7 +6095,105 @@
           <w:color w:val="000000"/>
           <w:lang w:val="en-US"/>
         </w:rPr>
-        <w:t xml:space="preserve">boot_main.mem </w:t>
+        <w:t>/</w:t>
+      </w:r>
+      <w:proofErr w:type="spellStart"/>
+      <w:r>
+        <w:rPr>
+          <w:rFonts w:eastAsia="Times New Roman" w:cs="Arial"/>
+          <w:i/>
+          <w:iCs/>
+          <w:color w:val="000000"/>
+          <w:lang w:val="en-US"/>
+        </w:rPr>
+        <w:t>VeeRwolf</w:t>
+      </w:r>
+      <w:proofErr w:type="spellEnd"/>
+      <w:r>
+        <w:rPr>
+          <w:rFonts w:eastAsia="Times New Roman" w:cs="Arial"/>
+          <w:i/>
+          <w:iCs/>
+          <w:color w:val="000000"/>
+          <w:lang w:val="en-US"/>
+        </w:rPr>
+        <w:t>/</w:t>
+      </w:r>
+      <w:proofErr w:type="spellStart"/>
+      <w:r>
+        <w:rPr>
+          <w:rFonts w:eastAsia="Times New Roman" w:cs="Arial"/>
+          <w:i/>
+          <w:iCs/>
+          <w:color w:val="000000"/>
+          <w:lang w:val="en-US"/>
+        </w:rPr>
+        <w:t>BootROM</w:t>
+      </w:r>
+      <w:proofErr w:type="spellEnd"/>
+      <w:r>
+        <w:rPr>
+          <w:rFonts w:eastAsia="Times New Roman" w:cs="Arial"/>
+          <w:i/>
+          <w:iCs/>
+          <w:color w:val="000000"/>
+          <w:lang w:val="en-US"/>
+        </w:rPr>
+        <w:t>/</w:t>
+      </w:r>
+      <w:proofErr w:type="spellStart"/>
+      <w:proofErr w:type="gramStart"/>
+      <w:r>
+        <w:rPr>
+          <w:rFonts w:eastAsia="Times New Roman" w:cs="Arial"/>
+          <w:i/>
+          <w:iCs/>
+          <w:color w:val="000000"/>
+          <w:lang w:val="en-US"/>
+        </w:rPr>
+        <w:t>sw</w:t>
+      </w:r>
+      <w:proofErr w:type="spellEnd"/>
+      <w:proofErr w:type="gramEnd"/>
+      <w:r>
+        <w:rPr>
+          <w:rFonts w:eastAsia="Times New Roman" w:cs="Arial"/>
+          <w:i/>
+          <w:iCs/>
+          <w:color w:val="000000"/>
+          <w:lang w:val="en-US"/>
+        </w:rPr>
+        <w:t xml:space="preserve"> </w:t>
+      </w:r>
+      <w:r>
+        <w:rPr>
+          <w:rFonts w:eastAsia="Times New Roman" w:cs="Arial"/>
+          <w:color w:val="000000"/>
+          <w:lang w:val="en-US"/>
+        </w:rPr>
+        <w:t xml:space="preserve">and select </w:t>
+      </w:r>
+      <w:proofErr w:type="spellStart"/>
+      <w:r>
+        <w:rPr>
+          <w:rFonts w:eastAsia="Times New Roman" w:cs="Arial"/>
+          <w:i/>
+          <w:iCs/>
+          <w:color w:val="000000"/>
+          <w:lang w:val="en-US"/>
+        </w:rPr>
+        <w:t>boot_main.mem</w:t>
+      </w:r>
+      <w:proofErr w:type="spellEnd"/>
+      <w:r>
+        <w:rPr>
+          <w:rFonts w:eastAsia="Times New Roman" w:cs="Arial"/>
+          <w:i/>
+          <w:iCs/>
+          <w:color w:val="000000"/>
+          <w:lang w:val="en-US"/>
+        </w:rPr>
+        <w:t xml:space="preserve"> </w:t>
       </w:r>
       <w:r>
         <w:rPr>
@@ -5457,6 +6289,7 @@
           <w:noProof/>
           <w:lang w:val="es-ES" w:eastAsia="es-ES"/>
         </w:rPr>
+        <w:lastRenderedPageBreak/>
         <w:drawing>
           <wp:inline distT="0" distB="0" distL="0" distR="0" wp14:anchorId="47BFC83F" wp14:editId="15D78E0C">
             <wp:extent cx="5731510" cy="3513455"/>
@@ -5528,12 +6361,14 @@
       <w:r>
         <w:t xml:space="preserve">. Add Memory File </w:t>
       </w:r>
+      <w:proofErr w:type="spellStart"/>
       <w:r>
         <w:rPr>
           <w:i/>
         </w:rPr>
         <w:t>boot_main.mem</w:t>
       </w:r>
+      <w:proofErr w:type="spellEnd"/>
     </w:p>
     <w:p>
       <w:pPr>
@@ -5554,6 +6389,7 @@
         </w:rPr>
         <w:t>This file (</w:t>
       </w:r>
+      <w:proofErr w:type="spellStart"/>
       <w:r>
         <w:rPr>
           <w:rFonts w:eastAsia="Times New Roman" w:cs="Arial"/>
@@ -5562,6 +6398,7 @@
         </w:rPr>
         <w:t>boot_main.mem</w:t>
       </w:r>
+      <w:proofErr w:type="spellEnd"/>
       <w:r>
         <w:rPr>
           <w:rFonts w:eastAsia="Times New Roman" w:cs="Arial"/>
@@ -5582,15 +6419,16 @@
           <w:i/>
           <w:iCs/>
         </w:rPr>
-        <w:t>Nexys Video</w:t>
-      </w:r>
+        <w:t xml:space="preserve">Nexys </w:t>
+      </w:r>
+      <w:proofErr w:type="spellStart"/>
       <w:r>
         <w:rPr>
           <w:rFonts w:cs="Arial"/>
           <w:i/>
           <w:iCs/>
         </w:rPr>
-        <w:t>VideoNoDDRPath]</w:t>
+        <w:t>Video</w:t>
       </w:r>
       <w:r>
         <w:rPr>
@@ -5598,8 +6436,26 @@
           <w:i/>
           <w:iCs/>
         </w:rPr>
+        <w:t>VideoNoDDRPath</w:t>
+      </w:r>
+      <w:proofErr w:type="spellEnd"/>
+      <w:r>
+        <w:rPr>
+          <w:rFonts w:cs="Arial"/>
+          <w:i/>
+          <w:iCs/>
+        </w:rPr>
+        <w:t>]</w:t>
+      </w:r>
+      <w:r>
+        <w:rPr>
+          <w:rFonts w:cs="Arial"/>
+          <w:i/>
+          <w:iCs/>
+        </w:rPr>
         <w:t>/</w:t>
       </w:r>
+      <w:proofErr w:type="spellStart"/>
       <w:r>
         <w:rPr>
           <w:rFonts w:eastAsia="Times New Roman" w:cs="Arial"/>
@@ -5608,8 +6464,9 @@
           <w:color w:val="000000" w:themeColor="text1"/>
           <w:lang w:val="en-US"/>
         </w:rPr>
-        <w:t>src/rvfpga</w:t>
-      </w:r>
+        <w:t>src</w:t>
+      </w:r>
+      <w:proofErr w:type="spellEnd"/>
       <w:r>
         <w:rPr>
           <w:rFonts w:eastAsia="Times New Roman" w:cs="Arial"/>
@@ -5618,7 +6475,39 @@
           <w:color w:val="000000" w:themeColor="text1"/>
           <w:lang w:val="en-US"/>
         </w:rPr>
-        <w:t>Nexys Video</w:t>
+        <w:t>/</w:t>
+      </w:r>
+      <w:proofErr w:type="spellStart"/>
+      <w:r>
+        <w:rPr>
+          <w:rFonts w:eastAsia="Times New Roman" w:cs="Arial"/>
+          <w:i/>
+          <w:iCs/>
+          <w:color w:val="000000" w:themeColor="text1"/>
+          <w:lang w:val="en-US"/>
+        </w:rPr>
+        <w:t>rvfpga</w:t>
+      </w:r>
+      <w:r>
+        <w:rPr>
+          <w:rFonts w:eastAsia="Times New Roman" w:cs="Arial"/>
+          <w:i/>
+          <w:iCs/>
+          <w:color w:val="000000" w:themeColor="text1"/>
+          <w:lang w:val="en-US"/>
+        </w:rPr>
+        <w:t>Nexys</w:t>
+      </w:r>
+      <w:proofErr w:type="spellEnd"/>
+      <w:r>
+        <w:rPr>
+          <w:rFonts w:eastAsia="Times New Roman" w:cs="Arial"/>
+          <w:i/>
+          <w:iCs/>
+          <w:color w:val="000000" w:themeColor="text1"/>
+          <w:lang w:val="en-US"/>
+        </w:rPr>
+        <w:t xml:space="preserve"> Video</w:t>
       </w:r>
       <w:r>
         <w:rPr>
@@ -6111,14 +7000,23 @@
           <w:sz w:val="16"/>
           <w:szCs w:val="16"/>
         </w:rPr>
-        <w:t>Nexys Video</w:t>
-      </w:r>
+        <w:t xml:space="preserve">Nexys </w:t>
+      </w:r>
+      <w:proofErr w:type="gramStart"/>
       <w:r>
         <w:rPr>
           <w:rFonts w:ascii="Courier New" w:hAnsi="Courier New" w:cs="Courier New"/>
           <w:sz w:val="16"/>
           <w:szCs w:val="16"/>
         </w:rPr>
+        <w:t>Video</w:t>
+      </w:r>
+      <w:r>
+        <w:rPr>
+          <w:rFonts w:ascii="Courier New" w:hAnsi="Courier New" w:cs="Courier New"/>
+          <w:sz w:val="16"/>
+          <w:szCs w:val="16"/>
+        </w:rPr>
         <w:t>VideoNoDDRPath]</w:t>
       </w:r>
       <w:r>
@@ -6159,17 +7057,26 @@
           <w:sz w:val="16"/>
           <w:szCs w:val="16"/>
         </w:rPr>
-        <w:t>latform.org__axi_0.25.0/include</w:t>
-      </w:r>
-    </w:p>
-    <w:p>
-      <w:pPr>
-        <w:ind w:right="-897"/>
+        <w:t>latform.org__axi</w:t>
+      </w:r>
+      <w:proofErr w:type="gramEnd"/>
+      <w:r>
         <w:rPr>
           <w:rFonts w:ascii="Courier New" w:eastAsia="Times New Roman" w:hAnsi="Courier New" w:cs="Courier New"/>
           <w:sz w:val="16"/>
           <w:szCs w:val="16"/>
         </w:rPr>
+        <w:t>_0.25.0/include</w:t>
+      </w:r>
+    </w:p>
+    <w:p>
+      <w:pPr>
+        <w:ind w:right="-897"/>
+        <w:rPr>
+          <w:rFonts w:ascii="Courier New" w:eastAsia="Times New Roman" w:hAnsi="Courier New" w:cs="Courier New"/>
+          <w:sz w:val="16"/>
+          <w:szCs w:val="16"/>
+        </w:rPr>
       </w:pPr>
       <w:r>
         <w:rPr>
@@ -6185,14 +7092,23 @@
           <w:sz w:val="16"/>
           <w:szCs w:val="16"/>
         </w:rPr>
-        <w:t>Nexys Video</w:t>
-      </w:r>
+        <w:t xml:space="preserve">Nexys </w:t>
+      </w:r>
+      <w:proofErr w:type="gramStart"/>
       <w:r>
         <w:rPr>
           <w:rFonts w:ascii="Courier New" w:hAnsi="Courier New" w:cs="Courier New"/>
           <w:sz w:val="16"/>
           <w:szCs w:val="16"/>
         </w:rPr>
+        <w:t>Video</w:t>
+      </w:r>
+      <w:r>
+        <w:rPr>
+          <w:rFonts w:ascii="Courier New" w:hAnsi="Courier New" w:cs="Courier New"/>
+          <w:sz w:val="16"/>
+          <w:szCs w:val="16"/>
+        </w:rPr>
         <w:t>VideoNoDDRPath]</w:t>
       </w:r>
       <w:r>
@@ -6209,7 +7125,16 @@
           <w:sz w:val="16"/>
           <w:szCs w:val="16"/>
         </w:rPr>
-        <w:t>src/OtherSources/pulp-platform.org__common_cells_1.20.0/include</w:t>
+        <w:t>src/OtherSources/pulp-platform.org__common_cells</w:t>
+      </w:r>
+      <w:proofErr w:type="gramEnd"/>
+      <w:r>
+        <w:rPr>
+          <w:rFonts w:ascii="Courier New" w:eastAsia="Times New Roman" w:hAnsi="Courier New" w:cs="Courier New"/>
+          <w:sz w:val="16"/>
+          <w:szCs w:val="16"/>
+        </w:rPr>
+        <w:t>_1.20.0/include</w:t>
       </w:r>
     </w:p>
     <w:p>
@@ -6229,6 +7154,7 @@
         <w:rPr>
           <w:noProof/>
         </w:rPr>
+        <w:lastRenderedPageBreak/>
         <w:drawing>
           <wp:inline distT="0" distB="0" distL="0" distR="0" wp14:anchorId="68889D25" wp14:editId="60AB34F3">
             <wp:extent cx="7232196" cy="4625592"/>
@@ -6386,7 +7312,25 @@
           <w:b/>
           <w:bCs/>
         </w:rPr>
-        <w:t>Implementation – Opt Design</w:t>
+        <w:t xml:space="preserve">Implementation – </w:t>
+      </w:r>
+      <w:proofErr w:type="spellStart"/>
+      <w:r>
+        <w:rPr>
+          <w:rFonts w:eastAsia="Times New Roman" w:cs="Arial"/>
+          <w:b/>
+          <w:bCs/>
+        </w:rPr>
+        <w:t>Opt</w:t>
+      </w:r>
+      <w:proofErr w:type="spellEnd"/>
+      <w:r>
+        <w:rPr>
+          <w:rFonts w:eastAsia="Times New Roman" w:cs="Arial"/>
+          <w:b/>
+          <w:bCs/>
+        </w:rPr>
+        <w:t xml:space="preserve"> Design</w:t>
       </w:r>
       <w:r>
         <w:rPr>
@@ -6463,8 +7407,9 @@
         <w:rPr>
           <w:noProof/>
         </w:rPr>
+        <w:lastRenderedPageBreak/>
         <w:drawing>
-          <wp:inline distT="0" distB="0" distL="0" distR="0" wp14:anchorId="71A0F11A" wp14:editId="24AB9896">
+          <wp:inline distT="0" distB="0" distL="0" distR="0" wp14:anchorId="71A0F11A" wp14:editId="60901D5E">
             <wp:extent cx="5673530" cy="3475038"/>
             <wp:effectExtent l="0" t="0" r="0" b="0"/>
             <wp:docPr id="480396064" name="Picture 480396064"/>
@@ -6782,6 +7727,7 @@
           <w:noProof/>
           <w:lang w:val="es-ES" w:eastAsia="es-ES"/>
         </w:rPr>
+        <w:lastRenderedPageBreak/>
         <w:drawing>
           <wp:inline distT="0" distB="0" distL="0" distR="0" wp14:anchorId="710E2D5A" wp14:editId="64C07599">
             <wp:extent cx="2781300" cy="3842413"/>
@@ -7166,6 +8112,7 @@
         <w:rPr>
           <w:b w:val="0"/>
         </w:rPr>
+        <w:lastRenderedPageBreak/>
         <w:t xml:space="preserve">Now that you have built the </w:t>
       </w:r>
       <w:r>
@@ -7298,7 +8245,21 @@
         <w:rPr>
           <w:rFonts w:cs="Arial"/>
         </w:rPr>
-        <w:t>You can find the bitstream just generated by Vivado in folder:</w:t>
+        <w:t xml:space="preserve">You can find the bitstream just generated by </w:t>
+      </w:r>
+      <w:proofErr w:type="spellStart"/>
+      <w:r>
+        <w:rPr>
+          <w:rFonts w:cs="Arial"/>
+        </w:rPr>
+        <w:t>Vivado</w:t>
+      </w:r>
+      <w:proofErr w:type="spellEnd"/>
+      <w:r>
+        <w:rPr>
+          <w:rFonts w:cs="Arial"/>
+        </w:rPr>
+        <w:t xml:space="preserve"> in folder:</w:t>
       </w:r>
     </w:p>
     <w:p>
@@ -7344,18 +8305,33 @@
         <w:rPr>
           <w:rFonts w:ascii="Courier New" w:hAnsi="Courier New" w:cs="Courier New"/>
         </w:rPr>
-        <w:t>Nexys Video</w:t>
-      </w:r>
+        <w:t xml:space="preserve">Nexys </w:t>
+      </w:r>
+      <w:proofErr w:type="spellStart"/>
+      <w:proofErr w:type="gramStart"/>
       <w:r>
         <w:rPr>
           <w:rFonts w:ascii="Courier New" w:hAnsi="Courier New" w:cs="Courier New"/>
         </w:rPr>
-        <w:t>VideoNoDDRPath]</w:t>
+        <w:t>Video</w:t>
       </w:r>
       <w:r>
         <w:rPr>
           <w:rFonts w:ascii="Courier New" w:hAnsi="Courier New" w:cs="Courier New"/>
         </w:rPr>
+        <w:t>VideoNoDDRPath</w:t>
+      </w:r>
+      <w:proofErr w:type="spellEnd"/>
+      <w:r>
+        <w:rPr>
+          <w:rFonts w:ascii="Courier New" w:hAnsi="Courier New" w:cs="Courier New"/>
+        </w:rPr>
+        <w:t>]</w:t>
+      </w:r>
+      <w:r>
+        <w:rPr>
+          <w:rFonts w:ascii="Courier New" w:hAnsi="Courier New" w:cs="Courier New"/>
+        </w:rPr>
         <w:t>/Labs/Lab05/project_</w:t>
       </w:r>
       <w:r>
@@ -7380,7 +8356,14 @@
         <w:rPr>
           <w:rFonts w:ascii="Courier New" w:hAnsi="Courier New" w:cs="Courier New"/>
         </w:rPr>
-        <w:t>.runs/impl_1</w:t>
+        <w:t>.runs</w:t>
+      </w:r>
+      <w:proofErr w:type="gramEnd"/>
+      <w:r>
+        <w:rPr>
+          <w:rFonts w:ascii="Courier New" w:hAnsi="Courier New" w:cs="Courier New"/>
+        </w:rPr>
+        <w:t>/impl_1</w:t>
       </w:r>
     </w:p>
     <w:p/>
@@ -7447,12 +8430,28 @@
         </w:rPr>
         <w:t xml:space="preserve"> onto the </w:t>
       </w:r>
-      <w:r>
-        <w:rPr>
-          <w:rFonts w:cs="Arial"/>
-        </w:rPr>
-        <w:t>Nexys Video Video</w:t>
-      </w:r>
+      <w:proofErr w:type="spellStart"/>
+      <w:r>
+        <w:rPr>
+          <w:rFonts w:cs="Arial"/>
+        </w:rPr>
+        <w:t>Nexys</w:t>
+      </w:r>
+      <w:proofErr w:type="spellEnd"/>
+      <w:r>
+        <w:rPr>
+          <w:rFonts w:cs="Arial"/>
+        </w:rPr>
+        <w:t xml:space="preserve"> Video </w:t>
+      </w:r>
+      <w:proofErr w:type="spellStart"/>
+      <w:r>
+        <w:rPr>
+          <w:rFonts w:cs="Arial"/>
+        </w:rPr>
+        <w:t>Video</w:t>
+      </w:r>
+      <w:proofErr w:type="spellEnd"/>
       <w:r>
         <w:rPr>
           <w:rFonts w:cs="Arial"/>
@@ -7543,12 +8542,28 @@
         </w:rPr>
         <w:t xml:space="preserve">system onto the FPGA on the </w:t>
       </w:r>
-      <w:r>
-        <w:rPr>
-          <w:rFonts w:cs="Arial"/>
-        </w:rPr>
-        <w:t>Nexys Video Video</w:t>
-      </w:r>
+      <w:proofErr w:type="spellStart"/>
+      <w:r>
+        <w:rPr>
+          <w:rFonts w:cs="Arial"/>
+        </w:rPr>
+        <w:t>Nexys</w:t>
+      </w:r>
+      <w:proofErr w:type="spellEnd"/>
+      <w:r>
+        <w:rPr>
+          <w:rFonts w:cs="Arial"/>
+        </w:rPr>
+        <w:t xml:space="preserve"> Video </w:t>
+      </w:r>
+      <w:proofErr w:type="spellStart"/>
+      <w:r>
+        <w:rPr>
+          <w:rFonts w:cs="Arial"/>
+        </w:rPr>
+        <w:t>Video</w:t>
+      </w:r>
+      <w:proofErr w:type="spellEnd"/>
       <w:r>
         <w:rPr>
           <w:rFonts w:cs="Arial"/>
@@ -7718,7 +8733,23 @@
         <w:sz w:val="12"/>
         <w:szCs w:val="12"/>
       </w:rPr>
-      <w:t>Creating a Vivado Project</w:t>
+      <w:t xml:space="preserve">Creating a </w:t>
+    </w:r>
+    <w:proofErr w:type="spellStart"/>
+    <w:r>
+      <w:rPr>
+        <w:sz w:val="12"/>
+        <w:szCs w:val="12"/>
+      </w:rPr>
+      <w:t>Vivado</w:t>
+    </w:r>
+    <w:proofErr w:type="spellEnd"/>
+    <w:r>
+      <w:rPr>
+        <w:sz w:val="12"/>
+        <w:szCs w:val="12"/>
+      </w:rPr>
+      <w:t xml:space="preserve"> Project</w:t>
     </w:r>
   </w:p>
   <w:p>
@@ -7873,7 +8904,23 @@
         <w:sz w:val="12"/>
         <w:szCs w:val="12"/>
       </w:rPr>
-      <w:t>Creating a Vivado Project</w:t>
+      <w:t xml:space="preserve">Creating a </w:t>
+    </w:r>
+    <w:proofErr w:type="spellStart"/>
+    <w:r>
+      <w:rPr>
+        <w:sz w:val="12"/>
+        <w:szCs w:val="12"/>
+      </w:rPr>
+      <w:t>Vivado</w:t>
+    </w:r>
+    <w:proofErr w:type="spellEnd"/>
+    <w:r>
+      <w:rPr>
+        <w:sz w:val="12"/>
+        <w:szCs w:val="12"/>
+      </w:rPr>
+      <w:t xml:space="preserve"> Project</w:t>
     </w:r>
   </w:p>
   <w:p>

</xml_diff>